<commit_message>
Add completed Kubernetes documentation
</commit_message>
<xml_diff>
--- a/Documentation.docx
+++ b/Documentation.docx
@@ -57,8 +57,19 @@
           <w:szCs w:val="24"/>
           <w:lang w:eastAsia="en-IN"/>
         </w:rPr>
-        <w:t xml:space="preserve"> Namrata</w:t>
-      </w:r>
+        <w:t xml:space="preserve"> </w:t>
+      </w:r>
+      <w:proofErr w:type="spellStart"/>
+      <w:r>
+        <w:rPr>
+          <w:rFonts w:ascii="Times New Roman" w:eastAsia="Times New Roman" w:hAnsi="Times New Roman" w:cs="Times New Roman"/>
+          <w:sz w:val="24"/>
+          <w:szCs w:val="24"/>
+          <w:lang w:eastAsia="en-IN"/>
+        </w:rPr>
+        <w:t>Namrata</w:t>
+      </w:r>
+      <w:proofErr w:type="spellEnd"/>
       <w:r>
         <w:rPr>
           <w:rFonts w:ascii="Times New Roman" w:eastAsia="Times New Roman" w:hAnsi="Times New Roman" w:cs="Times New Roman"/>
@@ -115,8 +126,19 @@
           <w:szCs w:val="24"/>
           <w:lang w:eastAsia="en-IN"/>
         </w:rPr>
-        <w:t xml:space="preserve"> Kubernetes_Namrata</w:t>
-      </w:r>
+        <w:t xml:space="preserve"> </w:t>
+      </w:r>
+      <w:proofErr w:type="spellStart"/>
+      <w:r>
+        <w:rPr>
+          <w:rFonts w:ascii="Times New Roman" w:eastAsia="Times New Roman" w:hAnsi="Times New Roman" w:cs="Times New Roman"/>
+          <w:sz w:val="24"/>
+          <w:szCs w:val="24"/>
+          <w:lang w:eastAsia="en-IN"/>
+        </w:rPr>
+        <w:t>Kubernetes_Namrata</w:t>
+      </w:r>
+      <w:proofErr w:type="spellEnd"/>
     </w:p>
     <w:p>
       <w:pPr>
@@ -182,27 +204,67 @@
           <w:szCs w:val="24"/>
           <w:lang w:eastAsia="en-IN"/>
         </w:rPr>
-        <w:t>The objective of this assignment is to deploy the Flask backend and Node.js frontend from the previous Docker assignment into a local Kubernetes cluster using Minikube.</w:t>
-      </w:r>
-    </w:p>
-    <w:p>
-      <w:pPr>
-        <w:spacing w:before="100" w:beforeAutospacing="1" w:after="100" w:afterAutospacing="1" w:line="240" w:lineRule="auto"/>
-        <w:rPr>
-          <w:rFonts w:ascii="Times New Roman" w:eastAsia="Times New Roman" w:hAnsi="Times New Roman" w:cs="Times New Roman"/>
-          <w:sz w:val="24"/>
-          <w:szCs w:val="24"/>
-          <w:lang w:eastAsia="en-IN"/>
-        </w:rPr>
-      </w:pPr>
-      <w:r>
-        <w:rPr>
-          <w:rFonts w:ascii="Times New Roman" w:eastAsia="Times New Roman" w:hAnsi="Times New Roman" w:cs="Times New Roman"/>
-          <w:sz w:val="24"/>
-          <w:szCs w:val="24"/>
-          <w:lang w:eastAsia="en-IN"/>
-        </w:rPr>
-        <w:t>The application was containerized using Docker, the Docker images were loaded into Minikube, and Kubernetes Deployment and Service YAML files were created for both the backend and frontend.</w:t>
+        <w:t xml:space="preserve">The objective of this assignment is to deploy the Flask backend and Node.js frontend from the previous Docker assignment into a local Kubernetes cluster using </w:t>
+      </w:r>
+      <w:proofErr w:type="spellStart"/>
+      <w:r>
+        <w:rPr>
+          <w:rFonts w:ascii="Times New Roman" w:eastAsia="Times New Roman" w:hAnsi="Times New Roman" w:cs="Times New Roman"/>
+          <w:sz w:val="24"/>
+          <w:szCs w:val="24"/>
+          <w:lang w:eastAsia="en-IN"/>
+        </w:rPr>
+        <w:t>Minikube</w:t>
+      </w:r>
+      <w:proofErr w:type="spellEnd"/>
+      <w:r>
+        <w:rPr>
+          <w:rFonts w:ascii="Times New Roman" w:eastAsia="Times New Roman" w:hAnsi="Times New Roman" w:cs="Times New Roman"/>
+          <w:sz w:val="24"/>
+          <w:szCs w:val="24"/>
+          <w:lang w:eastAsia="en-IN"/>
+        </w:rPr>
+        <w:t>.</w:t>
+      </w:r>
+    </w:p>
+    <w:p>
+      <w:pPr>
+        <w:spacing w:before="100" w:beforeAutospacing="1" w:after="100" w:afterAutospacing="1" w:line="240" w:lineRule="auto"/>
+        <w:rPr>
+          <w:rFonts w:ascii="Times New Roman" w:eastAsia="Times New Roman" w:hAnsi="Times New Roman" w:cs="Times New Roman"/>
+          <w:sz w:val="24"/>
+          <w:szCs w:val="24"/>
+          <w:lang w:eastAsia="en-IN"/>
+        </w:rPr>
+      </w:pPr>
+      <w:r>
+        <w:rPr>
+          <w:rFonts w:ascii="Times New Roman" w:eastAsia="Times New Roman" w:hAnsi="Times New Roman" w:cs="Times New Roman"/>
+          <w:sz w:val="24"/>
+          <w:szCs w:val="24"/>
+          <w:lang w:eastAsia="en-IN"/>
+        </w:rPr>
+        <w:t xml:space="preserve">The application was containerized using Docker, the Docker images were loaded into </w:t>
+      </w:r>
+      <w:proofErr w:type="spellStart"/>
+      <w:r>
+        <w:rPr>
+          <w:rFonts w:ascii="Times New Roman" w:eastAsia="Times New Roman" w:hAnsi="Times New Roman" w:cs="Times New Roman"/>
+          <w:sz w:val="24"/>
+          <w:szCs w:val="24"/>
+          <w:lang w:eastAsia="en-IN"/>
+        </w:rPr>
+        <w:t>Minikube</w:t>
+      </w:r>
+      <w:proofErr w:type="spellEnd"/>
+      <w:r>
+        <w:rPr>
+          <w:rFonts w:ascii="Times New Roman" w:eastAsia="Times New Roman" w:hAnsi="Times New Roman" w:cs="Times New Roman"/>
+          <w:sz w:val="24"/>
+          <w:szCs w:val="24"/>
+          <w:lang w:eastAsia="en-IN"/>
+        </w:rPr>
+        <w:t>, and Kubernetes Deployment and Service YAML files were created for both the backend and frontend.</w:t>
       </w:r>
     </w:p>
     <w:p>
@@ -224,6 +286,7 @@
         </w:rPr>
         <w:t xml:space="preserve">The deployments were verified using </w:t>
       </w:r>
+      <w:proofErr w:type="spellStart"/>
       <w:r>
         <w:rPr>
           <w:rFonts w:ascii="Courier New" w:eastAsia="Times New Roman" w:hAnsi="Courier New" w:cs="Courier New"/>
@@ -233,6 +296,7 @@
         </w:rPr>
         <w:t>kubectl</w:t>
       </w:r>
+      <w:proofErr w:type="spellEnd"/>
       <w:r>
         <w:rPr>
           <w:rFonts w:ascii="Times New Roman" w:eastAsia="Times New Roman" w:hAnsi="Times New Roman" w:cs="Times New Roman"/>
@@ -400,6 +464,7 @@
           <w:lang w:eastAsia="en-IN"/>
         </w:rPr>
       </w:pPr>
+      <w:proofErr w:type="spellStart"/>
       <w:r>
         <w:rPr>
           <w:rFonts w:ascii="Times New Roman" w:eastAsia="Times New Roman" w:hAnsi="Times New Roman" w:cs="Times New Roman"/>
@@ -409,6 +474,7 @@
         </w:rPr>
         <w:t>Minikube</w:t>
       </w:r>
+      <w:proofErr w:type="spellEnd"/>
     </w:p>
     <w:p>
       <w:pPr>
@@ -424,6 +490,7 @@
           <w:lang w:eastAsia="en-IN"/>
         </w:rPr>
       </w:pPr>
+      <w:proofErr w:type="spellStart"/>
       <w:r>
         <w:rPr>
           <w:rFonts w:ascii="Times New Roman" w:eastAsia="Times New Roman" w:hAnsi="Times New Roman" w:cs="Times New Roman"/>
@@ -433,6 +500,7 @@
         </w:rPr>
         <w:t>kubectl</w:t>
       </w:r>
+      <w:proofErr w:type="spellEnd"/>
     </w:p>
     <w:p>
       <w:pPr>
@@ -941,6 +1009,7 @@
           <w:lang w:eastAsia="en-IN"/>
         </w:rPr>
       </w:pPr>
+      <w:proofErr w:type="spellStart"/>
       <w:r>
         <w:rPr>
           <w:rFonts w:ascii="Courier New" w:eastAsia="Times New Roman" w:hAnsi="Courier New" w:cs="Courier New"/>
@@ -950,6 +1019,7 @@
         </w:rPr>
         <w:t>Kubernetes_Namrata</w:t>
       </w:r>
+      <w:proofErr w:type="spellEnd"/>
     </w:p>
     <w:p>
       <w:pPr>
@@ -1101,8 +1171,19 @@
           <w:szCs w:val="20"/>
           <w:lang w:eastAsia="en-IN"/>
         </w:rPr>
-        <w:t>│   ├── Dockerfile</w:t>
-      </w:r>
+        <w:t xml:space="preserve">│   ├── </w:t>
+      </w:r>
+      <w:proofErr w:type="spellStart"/>
+      <w:r>
+        <w:rPr>
+          <w:rFonts w:ascii="Courier New" w:eastAsia="Times New Roman" w:hAnsi="Courier New" w:cs="Courier New"/>
+          <w:sz w:val="20"/>
+          <w:szCs w:val="20"/>
+          <w:lang w:eastAsia="en-IN"/>
+        </w:rPr>
+        <w:t>Dockerfile</w:t>
+      </w:r>
+      <w:proofErr w:type="spellEnd"/>
     </w:p>
     <w:p>
       <w:pPr>
@@ -1291,8 +1372,19 @@
           <w:szCs w:val="20"/>
           <w:lang w:eastAsia="en-IN"/>
         </w:rPr>
-        <w:t>│   ├── Dockerfile</w:t>
-      </w:r>
+        <w:t xml:space="preserve">│   ├── </w:t>
+      </w:r>
+      <w:proofErr w:type="spellStart"/>
+      <w:r>
+        <w:rPr>
+          <w:rFonts w:ascii="Courier New" w:eastAsia="Times New Roman" w:hAnsi="Courier New" w:cs="Courier New"/>
+          <w:sz w:val="20"/>
+          <w:szCs w:val="20"/>
+          <w:lang w:eastAsia="en-IN"/>
+        </w:rPr>
+        <w:t>Dockerfile</w:t>
+      </w:r>
+      <w:proofErr w:type="spellEnd"/>
     </w:p>
     <w:p>
       <w:pPr>
@@ -1329,8 +1421,21 @@
           <w:szCs w:val="20"/>
           <w:lang w:eastAsia="en-IN"/>
         </w:rPr>
-        <w:t>│   ├── package.json</w:t>
-      </w:r>
+        <w:t xml:space="preserve">│   ├── </w:t>
+      </w:r>
+      <w:proofErr w:type="spellStart"/>
+      <w:proofErr w:type="gramStart"/>
+      <w:r>
+        <w:rPr>
+          <w:rFonts w:ascii="Courier New" w:eastAsia="Times New Roman" w:hAnsi="Courier New" w:cs="Courier New"/>
+          <w:sz w:val="20"/>
+          <w:szCs w:val="20"/>
+          <w:lang w:eastAsia="en-IN"/>
+        </w:rPr>
+        <w:t>package.json</w:t>
+      </w:r>
+      <w:proofErr w:type="spellEnd"/>
+      <w:proofErr w:type="gramEnd"/>
     </w:p>
     <w:p>
       <w:pPr>
@@ -1481,8 +1586,21 @@
           <w:szCs w:val="20"/>
           <w:lang w:eastAsia="en-IN"/>
         </w:rPr>
-        <w:t>│   ├── backend.yaml</w:t>
-      </w:r>
+        <w:t xml:space="preserve">│   ├── </w:t>
+      </w:r>
+      <w:proofErr w:type="spellStart"/>
+      <w:proofErr w:type="gramStart"/>
+      <w:r>
+        <w:rPr>
+          <w:rFonts w:ascii="Courier New" w:eastAsia="Times New Roman" w:hAnsi="Courier New" w:cs="Courier New"/>
+          <w:sz w:val="20"/>
+          <w:szCs w:val="20"/>
+          <w:lang w:eastAsia="en-IN"/>
+        </w:rPr>
+        <w:t>backend.yaml</w:t>
+      </w:r>
+      <w:proofErr w:type="spellEnd"/>
+      <w:proofErr w:type="gramEnd"/>
     </w:p>
     <w:p>
       <w:pPr>
@@ -1519,8 +1637,21 @@
           <w:szCs w:val="20"/>
           <w:lang w:eastAsia="en-IN"/>
         </w:rPr>
-        <w:t>│   └── frontend.yaml</w:t>
-      </w:r>
+        <w:t xml:space="preserve">│   └── </w:t>
+      </w:r>
+      <w:proofErr w:type="spellStart"/>
+      <w:proofErr w:type="gramStart"/>
+      <w:r>
+        <w:rPr>
+          <w:rFonts w:ascii="Courier New" w:eastAsia="Times New Roman" w:hAnsi="Courier New" w:cs="Courier New"/>
+          <w:sz w:val="20"/>
+          <w:szCs w:val="20"/>
+          <w:lang w:eastAsia="en-IN"/>
+        </w:rPr>
+        <w:t>frontend.yaml</w:t>
+      </w:r>
+      <w:proofErr w:type="spellEnd"/>
+      <w:proofErr w:type="gramEnd"/>
     </w:p>
     <w:p>
       <w:pPr>
@@ -1975,27 +2106,64 @@
           <w:szCs w:val="48"/>
           <w:lang w:eastAsia="en-IN"/>
         </w:rPr>
-        <w:t>4. Minikube and Kubernetes Setup</w:t>
-      </w:r>
-    </w:p>
-    <w:p>
-      <w:pPr>
-        <w:spacing w:before="100" w:beforeAutospacing="1" w:after="100" w:afterAutospacing="1" w:line="240" w:lineRule="auto"/>
-        <w:rPr>
-          <w:rFonts w:ascii="Times New Roman" w:eastAsia="Times New Roman" w:hAnsi="Times New Roman" w:cs="Times New Roman"/>
-          <w:sz w:val="24"/>
-          <w:szCs w:val="24"/>
-          <w:lang w:eastAsia="en-IN"/>
-        </w:rPr>
-      </w:pPr>
-      <w:r>
-        <w:rPr>
-          <w:rFonts w:ascii="Times New Roman" w:eastAsia="Times New Roman" w:hAnsi="Times New Roman" w:cs="Times New Roman"/>
-          <w:sz w:val="24"/>
-          <w:szCs w:val="24"/>
-          <w:lang w:eastAsia="en-IN"/>
-        </w:rPr>
-        <w:t>Minikube was installed on Windows and started using Docker as the driver.</w:t>
+        <w:t xml:space="preserve">4. </w:t>
+      </w:r>
+      <w:proofErr w:type="spellStart"/>
+      <w:r>
+        <w:rPr>
+          <w:rFonts w:ascii="Times New Roman" w:eastAsia="Times New Roman" w:hAnsi="Times New Roman" w:cs="Times New Roman"/>
+          <w:b/>
+          <w:bCs/>
+          <w:kern w:val="36"/>
+          <w:sz w:val="48"/>
+          <w:szCs w:val="48"/>
+          <w:lang w:eastAsia="en-IN"/>
+        </w:rPr>
+        <w:t>Minikube</w:t>
+      </w:r>
+      <w:proofErr w:type="spellEnd"/>
+      <w:r>
+        <w:rPr>
+          <w:rFonts w:ascii="Times New Roman" w:eastAsia="Times New Roman" w:hAnsi="Times New Roman" w:cs="Times New Roman"/>
+          <w:b/>
+          <w:bCs/>
+          <w:kern w:val="36"/>
+          <w:sz w:val="48"/>
+          <w:szCs w:val="48"/>
+          <w:lang w:eastAsia="en-IN"/>
+        </w:rPr>
+        <w:t xml:space="preserve"> and Kubernetes Setup</w:t>
+      </w:r>
+    </w:p>
+    <w:p>
+      <w:pPr>
+        <w:spacing w:before="100" w:beforeAutospacing="1" w:after="100" w:afterAutospacing="1" w:line="240" w:lineRule="auto"/>
+        <w:rPr>
+          <w:rFonts w:ascii="Times New Roman" w:eastAsia="Times New Roman" w:hAnsi="Times New Roman" w:cs="Times New Roman"/>
+          <w:sz w:val="24"/>
+          <w:szCs w:val="24"/>
+          <w:lang w:eastAsia="en-IN"/>
+        </w:rPr>
+      </w:pPr>
+      <w:proofErr w:type="spellStart"/>
+      <w:r>
+        <w:rPr>
+          <w:rFonts w:ascii="Times New Roman" w:eastAsia="Times New Roman" w:hAnsi="Times New Roman" w:cs="Times New Roman"/>
+          <w:sz w:val="24"/>
+          <w:szCs w:val="24"/>
+          <w:lang w:eastAsia="en-IN"/>
+        </w:rPr>
+        <w:t>Minikube</w:t>
+      </w:r>
+      <w:proofErr w:type="spellEnd"/>
+      <w:r>
+        <w:rPr>
+          <w:rFonts w:ascii="Times New Roman" w:eastAsia="Times New Roman" w:hAnsi="Times New Roman" w:cs="Times New Roman"/>
+          <w:sz w:val="24"/>
+          <w:szCs w:val="24"/>
+          <w:lang w:eastAsia="en-IN"/>
+        </w:rPr>
+        <w:t xml:space="preserve"> was installed on Windows and started using Docker as the driver.</w:t>
       </w:r>
     </w:p>
     <w:p>
@@ -2046,34 +2214,76 @@
           <w:lang w:eastAsia="en-IN"/>
         </w:rPr>
       </w:pPr>
-      <w:r>
-        <w:rPr>
-          <w:rFonts w:ascii="Courier New" w:eastAsia="Times New Roman" w:hAnsi="Courier New" w:cs="Courier New"/>
-          <w:sz w:val="20"/>
-          <w:szCs w:val="20"/>
-          <w:lang w:eastAsia="en-IN"/>
-        </w:rPr>
-        <w:t>minikube start --driver=docker</w:t>
-      </w:r>
-    </w:p>
-    <w:p>
-      <w:pPr>
-        <w:spacing w:before="100" w:beforeAutospacing="1" w:after="100" w:afterAutospacing="1" w:line="240" w:lineRule="auto"/>
-        <w:rPr>
-          <w:rFonts w:ascii="Times New Roman" w:eastAsia="Times New Roman" w:hAnsi="Times New Roman" w:cs="Times New Roman"/>
-          <w:sz w:val="24"/>
-          <w:szCs w:val="24"/>
-          <w:lang w:eastAsia="en-IN"/>
-        </w:rPr>
-      </w:pPr>
-      <w:r>
-        <w:rPr>
-          <w:rFonts w:ascii="Times New Roman" w:eastAsia="Times New Roman" w:hAnsi="Times New Roman" w:cs="Times New Roman"/>
-          <w:sz w:val="24"/>
-          <w:szCs w:val="24"/>
-          <w:lang w:eastAsia="en-IN"/>
-        </w:rPr>
-        <w:t>The Minikube cluster started successfully with Kubernetes version 1.37.0.</w:t>
+      <w:proofErr w:type="spellStart"/>
+      <w:r>
+        <w:rPr>
+          <w:rFonts w:ascii="Courier New" w:eastAsia="Times New Roman" w:hAnsi="Courier New" w:cs="Courier New"/>
+          <w:sz w:val="20"/>
+          <w:szCs w:val="20"/>
+          <w:lang w:eastAsia="en-IN"/>
+        </w:rPr>
+        <w:t>minikube</w:t>
+      </w:r>
+      <w:proofErr w:type="spellEnd"/>
+      <w:r>
+        <w:rPr>
+          <w:rFonts w:ascii="Courier New" w:eastAsia="Times New Roman" w:hAnsi="Courier New" w:cs="Courier New"/>
+          <w:sz w:val="20"/>
+          <w:szCs w:val="20"/>
+          <w:lang w:eastAsia="en-IN"/>
+        </w:rPr>
+        <w:t xml:space="preserve"> start --driver=</w:t>
+      </w:r>
+      <w:proofErr w:type="spellStart"/>
+      <w:r>
+        <w:rPr>
+          <w:rFonts w:ascii="Courier New" w:eastAsia="Times New Roman" w:hAnsi="Courier New" w:cs="Courier New"/>
+          <w:sz w:val="20"/>
+          <w:szCs w:val="20"/>
+          <w:lang w:eastAsia="en-IN"/>
+        </w:rPr>
+        <w:t>docker</w:t>
+      </w:r>
+      <w:proofErr w:type="spellEnd"/>
+    </w:p>
+    <w:p>
+      <w:pPr>
+        <w:spacing w:before="100" w:beforeAutospacing="1" w:after="100" w:afterAutospacing="1" w:line="240" w:lineRule="auto"/>
+        <w:rPr>
+          <w:rFonts w:ascii="Times New Roman" w:eastAsia="Times New Roman" w:hAnsi="Times New Roman" w:cs="Times New Roman"/>
+          <w:sz w:val="24"/>
+          <w:szCs w:val="24"/>
+          <w:lang w:eastAsia="en-IN"/>
+        </w:rPr>
+      </w:pPr>
+      <w:r>
+        <w:rPr>
+          <w:rFonts w:ascii="Times New Roman" w:eastAsia="Times New Roman" w:hAnsi="Times New Roman" w:cs="Times New Roman"/>
+          <w:sz w:val="24"/>
+          <w:szCs w:val="24"/>
+          <w:lang w:eastAsia="en-IN"/>
+        </w:rPr>
+        <w:t xml:space="preserve">The </w:t>
+      </w:r>
+      <w:proofErr w:type="spellStart"/>
+      <w:r>
+        <w:rPr>
+          <w:rFonts w:ascii="Times New Roman" w:eastAsia="Times New Roman" w:hAnsi="Times New Roman" w:cs="Times New Roman"/>
+          <w:sz w:val="24"/>
+          <w:szCs w:val="24"/>
+          <w:lang w:eastAsia="en-IN"/>
+        </w:rPr>
+        <w:t>Minikube</w:t>
+      </w:r>
+      <w:proofErr w:type="spellEnd"/>
+      <w:r>
+        <w:rPr>
+          <w:rFonts w:ascii="Times New Roman" w:eastAsia="Times New Roman" w:hAnsi="Times New Roman" w:cs="Times New Roman"/>
+          <w:sz w:val="24"/>
+          <w:szCs w:val="24"/>
+          <w:lang w:eastAsia="en-IN"/>
+        </w:rPr>
+        <w:t xml:space="preserve"> cluster started successfully with Kubernetes version 1.37.0.</w:t>
       </w:r>
     </w:p>
     <w:p>
@@ -2124,14 +2334,25 @@
           <w:lang w:eastAsia="en-IN"/>
         </w:rPr>
       </w:pPr>
-      <w:r>
-        <w:rPr>
-          <w:rFonts w:ascii="Courier New" w:eastAsia="Times New Roman" w:hAnsi="Courier New" w:cs="Courier New"/>
-          <w:sz w:val="20"/>
-          <w:szCs w:val="20"/>
-          <w:lang w:eastAsia="en-IN"/>
-        </w:rPr>
-        <w:t>kubectl get nodes</w:t>
+      <w:proofErr w:type="spellStart"/>
+      <w:r>
+        <w:rPr>
+          <w:rFonts w:ascii="Courier New" w:eastAsia="Times New Roman" w:hAnsi="Courier New" w:cs="Courier New"/>
+          <w:sz w:val="20"/>
+          <w:szCs w:val="20"/>
+          <w:lang w:eastAsia="en-IN"/>
+        </w:rPr>
+        <w:t>kubectl</w:t>
+      </w:r>
+      <w:proofErr w:type="spellEnd"/>
+      <w:r>
+        <w:rPr>
+          <w:rFonts w:ascii="Courier New" w:eastAsia="Times New Roman" w:hAnsi="Courier New" w:cs="Courier New"/>
+          <w:sz w:val="20"/>
+          <w:szCs w:val="20"/>
+          <w:lang w:eastAsia="en-IN"/>
+        </w:rPr>
+        <w:t xml:space="preserve"> get nodes</w:t>
       </w:r>
     </w:p>
     <w:p>
@@ -2220,14 +2441,25 @@
           <w:lang w:eastAsia="en-IN"/>
         </w:rPr>
       </w:pPr>
-      <w:r>
-        <w:rPr>
-          <w:rFonts w:ascii="Courier New" w:eastAsia="Times New Roman" w:hAnsi="Courier New" w:cs="Courier New"/>
-          <w:sz w:val="20"/>
-          <w:szCs w:val="20"/>
-          <w:lang w:eastAsia="en-IN"/>
-        </w:rPr>
-        <w:t>minikube   Ready    control-plane   ...   v1.37.0</w:t>
+      <w:proofErr w:type="spellStart"/>
+      <w:r>
+        <w:rPr>
+          <w:rFonts w:ascii="Courier New" w:eastAsia="Times New Roman" w:hAnsi="Courier New" w:cs="Courier New"/>
+          <w:sz w:val="20"/>
+          <w:szCs w:val="20"/>
+          <w:lang w:eastAsia="en-IN"/>
+        </w:rPr>
+        <w:t>minikube</w:t>
+      </w:r>
+      <w:proofErr w:type="spellEnd"/>
+      <w:r>
+        <w:rPr>
+          <w:rFonts w:ascii="Courier New" w:eastAsia="Times New Roman" w:hAnsi="Courier New" w:cs="Courier New"/>
+          <w:sz w:val="20"/>
+          <w:szCs w:val="20"/>
+          <w:lang w:eastAsia="en-IN"/>
+        </w:rPr>
+        <w:t xml:space="preserve">   Ready    control-plane   ...   v1.37.0</w:t>
       </w:r>
     </w:p>
     <w:p>
@@ -2249,6 +2481,7 @@
         </w:rPr>
         <w:t xml:space="preserve">The </w:t>
       </w:r>
+      <w:proofErr w:type="spellStart"/>
       <w:r>
         <w:rPr>
           <w:rFonts w:ascii="Courier New" w:eastAsia="Times New Roman" w:hAnsi="Courier New" w:cs="Courier New"/>
@@ -2258,6 +2491,7 @@
         </w:rPr>
         <w:t>minikube</w:t>
       </w:r>
+      <w:proofErr w:type="spellEnd"/>
       <w:r>
         <w:rPr>
           <w:rFonts w:ascii="Times New Roman" w:eastAsia="Times New Roman" w:hAnsi="Times New Roman" w:cs="Times New Roman"/>
@@ -2316,7 +2550,47 @@
           <w:szCs w:val="24"/>
           <w:lang w:eastAsia="en-IN"/>
         </w:rPr>
-        <w:t xml:space="preserve"> Docker, kubectl and Minikube version information.</w:t>
+        <w:t xml:space="preserve"> Docker, </w:t>
+      </w:r>
+      <w:proofErr w:type="spellStart"/>
+      <w:r>
+        <w:rPr>
+          <w:rFonts w:ascii="Times New Roman" w:eastAsia="Times New Roman" w:hAnsi="Times New Roman" w:cs="Times New Roman"/>
+          <w:sz w:val="24"/>
+          <w:szCs w:val="24"/>
+          <w:lang w:eastAsia="en-IN"/>
+        </w:rPr>
+        <w:t>kubectl</w:t>
+      </w:r>
+      <w:proofErr w:type="spellEnd"/>
+      <w:r>
+        <w:rPr>
+          <w:rFonts w:ascii="Times New Roman" w:eastAsia="Times New Roman" w:hAnsi="Times New Roman" w:cs="Times New Roman"/>
+          <w:sz w:val="24"/>
+          <w:szCs w:val="24"/>
+          <w:lang w:eastAsia="en-IN"/>
+        </w:rPr>
+        <w:t xml:space="preserve"> and </w:t>
+      </w:r>
+      <w:proofErr w:type="spellStart"/>
+      <w:r>
+        <w:rPr>
+          <w:rFonts w:ascii="Times New Roman" w:eastAsia="Times New Roman" w:hAnsi="Times New Roman" w:cs="Times New Roman"/>
+          <w:sz w:val="24"/>
+          <w:szCs w:val="24"/>
+          <w:lang w:eastAsia="en-IN"/>
+        </w:rPr>
+        <w:t>Minikube</w:t>
+      </w:r>
+      <w:proofErr w:type="spellEnd"/>
+      <w:r>
+        <w:rPr>
+          <w:rFonts w:ascii="Times New Roman" w:eastAsia="Times New Roman" w:hAnsi="Times New Roman" w:cs="Times New Roman"/>
+          <w:sz w:val="24"/>
+          <w:szCs w:val="24"/>
+          <w:lang w:eastAsia="en-IN"/>
+        </w:rPr>
+        <w:t xml:space="preserve"> version information.</w:t>
       </w:r>
     </w:p>
     <w:p>
@@ -2347,7 +2621,47 @@
           <w:szCs w:val="24"/>
           <w:lang w:eastAsia="en-IN"/>
         </w:rPr>
-        <w:t xml:space="preserve"> Successful Minikube startup and Ready Kubernetes node.</w:t>
+        <w:t xml:space="preserve"> Successful </w:t>
+      </w:r>
+      <w:proofErr w:type="spellStart"/>
+      <w:r>
+        <w:rPr>
+          <w:rFonts w:ascii="Times New Roman" w:eastAsia="Times New Roman" w:hAnsi="Times New Roman" w:cs="Times New Roman"/>
+          <w:sz w:val="24"/>
+          <w:szCs w:val="24"/>
+          <w:lang w:eastAsia="en-IN"/>
+        </w:rPr>
+        <w:t>Minikube</w:t>
+      </w:r>
+      <w:proofErr w:type="spellEnd"/>
+      <w:r>
+        <w:rPr>
+          <w:rFonts w:ascii="Times New Roman" w:eastAsia="Times New Roman" w:hAnsi="Times New Roman" w:cs="Times New Roman"/>
+          <w:sz w:val="24"/>
+          <w:szCs w:val="24"/>
+          <w:lang w:eastAsia="en-IN"/>
+        </w:rPr>
+        <w:t xml:space="preserve"> </w:t>
+      </w:r>
+      <w:proofErr w:type="spellStart"/>
+      <w:r>
+        <w:rPr>
+          <w:rFonts w:ascii="Times New Roman" w:eastAsia="Times New Roman" w:hAnsi="Times New Roman" w:cs="Times New Roman"/>
+          <w:sz w:val="24"/>
+          <w:szCs w:val="24"/>
+          <w:lang w:eastAsia="en-IN"/>
+        </w:rPr>
+        <w:t>startup</w:t>
+      </w:r>
+      <w:proofErr w:type="spellEnd"/>
+      <w:r>
+        <w:rPr>
+          <w:rFonts w:ascii="Times New Roman" w:eastAsia="Times New Roman" w:hAnsi="Times New Roman" w:cs="Times New Roman"/>
+          <w:sz w:val="24"/>
+          <w:szCs w:val="24"/>
+          <w:lang w:eastAsia="en-IN"/>
+        </w:rPr>
+        <w:t xml:space="preserve"> and Ready Kubernetes node.</w:t>
       </w:r>
     </w:p>
     <w:p>
@@ -2479,14 +2793,45 @@
           <w:lang w:eastAsia="en-IN"/>
         </w:rPr>
       </w:pPr>
-      <w:r>
-        <w:rPr>
-          <w:rFonts w:ascii="Courier New" w:eastAsia="Times New Roman" w:hAnsi="Courier New" w:cs="Courier New"/>
-          <w:sz w:val="20"/>
-          <w:szCs w:val="20"/>
-          <w:lang w:eastAsia="en-IN"/>
-        </w:rPr>
-        <w:t>docker build -t assignment-5-backend .\backend</w:t>
+      <w:proofErr w:type="spellStart"/>
+      <w:r>
+        <w:rPr>
+          <w:rFonts w:ascii="Courier New" w:eastAsia="Times New Roman" w:hAnsi="Courier New" w:cs="Courier New"/>
+          <w:sz w:val="20"/>
+          <w:szCs w:val="20"/>
+          <w:lang w:eastAsia="en-IN"/>
+        </w:rPr>
+        <w:t>docker</w:t>
+      </w:r>
+      <w:proofErr w:type="spellEnd"/>
+      <w:r>
+        <w:rPr>
+          <w:rFonts w:ascii="Courier New" w:eastAsia="Times New Roman" w:hAnsi="Courier New" w:cs="Courier New"/>
+          <w:sz w:val="20"/>
+          <w:szCs w:val="20"/>
+          <w:lang w:eastAsia="en-IN"/>
+        </w:rPr>
+        <w:t xml:space="preserve"> build -t assignment-5-</w:t>
+      </w:r>
+      <w:proofErr w:type="gramStart"/>
+      <w:r>
+        <w:rPr>
+          <w:rFonts w:ascii="Courier New" w:eastAsia="Times New Roman" w:hAnsi="Courier New" w:cs="Courier New"/>
+          <w:sz w:val="20"/>
+          <w:szCs w:val="20"/>
+          <w:lang w:eastAsia="en-IN"/>
+        </w:rPr>
+        <w:t>backend .</w:t>
+      </w:r>
+      <w:proofErr w:type="gramEnd"/>
+      <w:r>
+        <w:rPr>
+          <w:rFonts w:ascii="Courier New" w:eastAsia="Times New Roman" w:hAnsi="Courier New" w:cs="Courier New"/>
+          <w:sz w:val="20"/>
+          <w:szCs w:val="20"/>
+          <w:lang w:eastAsia="en-IN"/>
+        </w:rPr>
+        <w:t>\backend</w:t>
       </w:r>
     </w:p>
     <w:p>
@@ -2537,14 +2882,45 @@
           <w:lang w:eastAsia="en-IN"/>
         </w:rPr>
       </w:pPr>
-      <w:r>
-        <w:rPr>
-          <w:rFonts w:ascii="Courier New" w:eastAsia="Times New Roman" w:hAnsi="Courier New" w:cs="Courier New"/>
-          <w:sz w:val="20"/>
-          <w:szCs w:val="20"/>
-          <w:lang w:eastAsia="en-IN"/>
-        </w:rPr>
-        <w:t>docker build -t assignment-5-frontend .\frontend</w:t>
+      <w:proofErr w:type="spellStart"/>
+      <w:r>
+        <w:rPr>
+          <w:rFonts w:ascii="Courier New" w:eastAsia="Times New Roman" w:hAnsi="Courier New" w:cs="Courier New"/>
+          <w:sz w:val="20"/>
+          <w:szCs w:val="20"/>
+          <w:lang w:eastAsia="en-IN"/>
+        </w:rPr>
+        <w:t>docker</w:t>
+      </w:r>
+      <w:proofErr w:type="spellEnd"/>
+      <w:r>
+        <w:rPr>
+          <w:rFonts w:ascii="Courier New" w:eastAsia="Times New Roman" w:hAnsi="Courier New" w:cs="Courier New"/>
+          <w:sz w:val="20"/>
+          <w:szCs w:val="20"/>
+          <w:lang w:eastAsia="en-IN"/>
+        </w:rPr>
+        <w:t xml:space="preserve"> build -t assignment-5-</w:t>
+      </w:r>
+      <w:proofErr w:type="gramStart"/>
+      <w:r>
+        <w:rPr>
+          <w:rFonts w:ascii="Courier New" w:eastAsia="Times New Roman" w:hAnsi="Courier New" w:cs="Courier New"/>
+          <w:sz w:val="20"/>
+          <w:szCs w:val="20"/>
+          <w:lang w:eastAsia="en-IN"/>
+        </w:rPr>
+        <w:t>frontend .</w:t>
+      </w:r>
+      <w:proofErr w:type="gramEnd"/>
+      <w:r>
+        <w:rPr>
+          <w:rFonts w:ascii="Courier New" w:eastAsia="Times New Roman" w:hAnsi="Courier New" w:cs="Courier New"/>
+          <w:sz w:val="20"/>
+          <w:szCs w:val="20"/>
+          <w:lang w:eastAsia="en-IN"/>
+        </w:rPr>
+        <w:t>\frontend</w:t>
       </w:r>
     </w:p>
     <w:p>
@@ -2595,14 +2971,25 @@
           <w:lang w:eastAsia="en-IN"/>
         </w:rPr>
       </w:pPr>
-      <w:r>
-        <w:rPr>
-          <w:rFonts w:ascii="Courier New" w:eastAsia="Times New Roman" w:hAnsi="Courier New" w:cs="Courier New"/>
-          <w:sz w:val="20"/>
-          <w:szCs w:val="20"/>
-          <w:lang w:eastAsia="en-IN"/>
-        </w:rPr>
-        <w:t>docker images</w:t>
+      <w:proofErr w:type="spellStart"/>
+      <w:r>
+        <w:rPr>
+          <w:rFonts w:ascii="Courier New" w:eastAsia="Times New Roman" w:hAnsi="Courier New" w:cs="Courier New"/>
+          <w:sz w:val="20"/>
+          <w:szCs w:val="20"/>
+          <w:lang w:eastAsia="en-IN"/>
+        </w:rPr>
+        <w:t>docker</w:t>
+      </w:r>
+      <w:proofErr w:type="spellEnd"/>
+      <w:r>
+        <w:rPr>
+          <w:rFonts w:ascii="Courier New" w:eastAsia="Times New Roman" w:hAnsi="Courier New" w:cs="Courier New"/>
+          <w:sz w:val="20"/>
+          <w:szCs w:val="20"/>
+          <w:lang w:eastAsia="en-IN"/>
+        </w:rPr>
+        <w:t xml:space="preserve"> images</w:t>
       </w:r>
     </w:p>
     <w:p>
@@ -2809,27 +3196,61 @@
           <w:szCs w:val="48"/>
           <w:lang w:eastAsia="en-IN"/>
         </w:rPr>
-        <w:t>6. Loading Docker Images into Minikube</w:t>
-      </w:r>
-    </w:p>
-    <w:p>
-      <w:pPr>
-        <w:spacing w:before="100" w:beforeAutospacing="1" w:after="100" w:afterAutospacing="1" w:line="240" w:lineRule="auto"/>
-        <w:rPr>
-          <w:rFonts w:ascii="Times New Roman" w:eastAsia="Times New Roman" w:hAnsi="Times New Roman" w:cs="Times New Roman"/>
-          <w:sz w:val="24"/>
-          <w:szCs w:val="24"/>
-          <w:lang w:eastAsia="en-IN"/>
-        </w:rPr>
-      </w:pPr>
-      <w:r>
-        <w:rPr>
-          <w:rFonts w:ascii="Times New Roman" w:eastAsia="Times New Roman" w:hAnsi="Times New Roman" w:cs="Times New Roman"/>
-          <w:sz w:val="24"/>
-          <w:szCs w:val="24"/>
-          <w:lang w:eastAsia="en-IN"/>
-        </w:rPr>
-        <w:t>The locally created Docker images were loaded into Minikube using:</w:t>
+        <w:t xml:space="preserve">6. Loading Docker Images into </w:t>
+      </w:r>
+      <w:proofErr w:type="spellStart"/>
+      <w:r>
+        <w:rPr>
+          <w:rFonts w:ascii="Times New Roman" w:eastAsia="Times New Roman" w:hAnsi="Times New Roman" w:cs="Times New Roman"/>
+          <w:b/>
+          <w:bCs/>
+          <w:kern w:val="36"/>
+          <w:sz w:val="48"/>
+          <w:szCs w:val="48"/>
+          <w:lang w:eastAsia="en-IN"/>
+        </w:rPr>
+        <w:t>Minikube</w:t>
+      </w:r>
+      <w:proofErr w:type="spellEnd"/>
+    </w:p>
+    <w:p>
+      <w:pPr>
+        <w:spacing w:before="100" w:beforeAutospacing="1" w:after="100" w:afterAutospacing="1" w:line="240" w:lineRule="auto"/>
+        <w:rPr>
+          <w:rFonts w:ascii="Times New Roman" w:eastAsia="Times New Roman" w:hAnsi="Times New Roman" w:cs="Times New Roman"/>
+          <w:sz w:val="24"/>
+          <w:szCs w:val="24"/>
+          <w:lang w:eastAsia="en-IN"/>
+        </w:rPr>
+      </w:pPr>
+      <w:r>
+        <w:rPr>
+          <w:rFonts w:ascii="Times New Roman" w:eastAsia="Times New Roman" w:hAnsi="Times New Roman" w:cs="Times New Roman"/>
+          <w:sz w:val="24"/>
+          <w:szCs w:val="24"/>
+          <w:lang w:eastAsia="en-IN"/>
+        </w:rPr>
+        <w:t xml:space="preserve">The locally created Docker images were loaded into </w:t>
+      </w:r>
+      <w:proofErr w:type="spellStart"/>
+      <w:r>
+        <w:rPr>
+          <w:rFonts w:ascii="Times New Roman" w:eastAsia="Times New Roman" w:hAnsi="Times New Roman" w:cs="Times New Roman"/>
+          <w:sz w:val="24"/>
+          <w:szCs w:val="24"/>
+          <w:lang w:eastAsia="en-IN"/>
+        </w:rPr>
+        <w:t>Minikube</w:t>
+      </w:r>
+      <w:proofErr w:type="spellEnd"/>
+      <w:r>
+        <w:rPr>
+          <w:rFonts w:ascii="Times New Roman" w:eastAsia="Times New Roman" w:hAnsi="Times New Roman" w:cs="Times New Roman"/>
+          <w:sz w:val="24"/>
+          <w:szCs w:val="24"/>
+          <w:lang w:eastAsia="en-IN"/>
+        </w:rPr>
+        <w:t xml:space="preserve"> using:</w:t>
       </w:r>
     </w:p>
     <w:p>
@@ -2860,15 +3281,37 @@
           <w:lang w:eastAsia="en-IN"/>
         </w:rPr>
       </w:pPr>
-      <w:r>
-        <w:rPr>
-          <w:rFonts w:ascii="Courier New" w:eastAsia="Times New Roman" w:hAnsi="Courier New" w:cs="Courier New"/>
-          <w:sz w:val="20"/>
-          <w:szCs w:val="20"/>
-          <w:lang w:eastAsia="en-IN"/>
-        </w:rPr>
-        <w:t>minikube image load assignment-5-backend:latest</w:t>
-      </w:r>
+      <w:proofErr w:type="spellStart"/>
+      <w:r>
+        <w:rPr>
+          <w:rFonts w:ascii="Courier New" w:eastAsia="Times New Roman" w:hAnsi="Courier New" w:cs="Courier New"/>
+          <w:sz w:val="20"/>
+          <w:szCs w:val="20"/>
+          <w:lang w:eastAsia="en-IN"/>
+        </w:rPr>
+        <w:t>minikube</w:t>
+      </w:r>
+      <w:proofErr w:type="spellEnd"/>
+      <w:r>
+        <w:rPr>
+          <w:rFonts w:ascii="Courier New" w:eastAsia="Times New Roman" w:hAnsi="Courier New" w:cs="Courier New"/>
+          <w:sz w:val="20"/>
+          <w:szCs w:val="20"/>
+          <w:lang w:eastAsia="en-IN"/>
+        </w:rPr>
+        <w:t xml:space="preserve"> image load assignment-5-</w:t>
+      </w:r>
+      <w:proofErr w:type="gramStart"/>
+      <w:r>
+        <w:rPr>
+          <w:rFonts w:ascii="Courier New" w:eastAsia="Times New Roman" w:hAnsi="Courier New" w:cs="Courier New"/>
+          <w:sz w:val="20"/>
+          <w:szCs w:val="20"/>
+          <w:lang w:eastAsia="en-IN"/>
+        </w:rPr>
+        <w:t>backend:latest</w:t>
+      </w:r>
+      <w:proofErr w:type="gramEnd"/>
     </w:p>
     <w:p>
       <w:pPr>
@@ -2918,15 +3361,37 @@
           <w:lang w:eastAsia="en-IN"/>
         </w:rPr>
       </w:pPr>
-      <w:r>
-        <w:rPr>
-          <w:rFonts w:ascii="Courier New" w:eastAsia="Times New Roman" w:hAnsi="Courier New" w:cs="Courier New"/>
-          <w:sz w:val="20"/>
-          <w:szCs w:val="20"/>
-          <w:lang w:eastAsia="en-IN"/>
-        </w:rPr>
-        <w:t>minikube image load assignment-5-frontend:latest</w:t>
-      </w:r>
+      <w:proofErr w:type="spellStart"/>
+      <w:r>
+        <w:rPr>
+          <w:rFonts w:ascii="Courier New" w:eastAsia="Times New Roman" w:hAnsi="Courier New" w:cs="Courier New"/>
+          <w:sz w:val="20"/>
+          <w:szCs w:val="20"/>
+          <w:lang w:eastAsia="en-IN"/>
+        </w:rPr>
+        <w:t>minikube</w:t>
+      </w:r>
+      <w:proofErr w:type="spellEnd"/>
+      <w:r>
+        <w:rPr>
+          <w:rFonts w:ascii="Courier New" w:eastAsia="Times New Roman" w:hAnsi="Courier New" w:cs="Courier New"/>
+          <w:sz w:val="20"/>
+          <w:szCs w:val="20"/>
+          <w:lang w:eastAsia="en-IN"/>
+        </w:rPr>
+        <w:t xml:space="preserve"> image load assignment-5-</w:t>
+      </w:r>
+      <w:proofErr w:type="gramStart"/>
+      <w:r>
+        <w:rPr>
+          <w:rFonts w:ascii="Courier New" w:eastAsia="Times New Roman" w:hAnsi="Courier New" w:cs="Courier New"/>
+          <w:sz w:val="20"/>
+          <w:szCs w:val="20"/>
+          <w:lang w:eastAsia="en-IN"/>
+        </w:rPr>
+        <w:t>frontend:latest</w:t>
+      </w:r>
+      <w:proofErr w:type="gramEnd"/>
     </w:p>
     <w:p>
       <w:pPr>
@@ -2976,34 +3441,65 @@
           <w:lang w:eastAsia="en-IN"/>
         </w:rPr>
       </w:pPr>
-      <w:r>
-        <w:rPr>
-          <w:rFonts w:ascii="Courier New" w:eastAsia="Times New Roman" w:hAnsi="Courier New" w:cs="Courier New"/>
-          <w:sz w:val="20"/>
-          <w:szCs w:val="20"/>
-          <w:lang w:eastAsia="en-IN"/>
-        </w:rPr>
-        <w:t>minikube image ls</w:t>
-      </w:r>
-    </w:p>
-    <w:p>
-      <w:pPr>
-        <w:spacing w:before="100" w:beforeAutospacing="1" w:after="100" w:afterAutospacing="1" w:line="240" w:lineRule="auto"/>
-        <w:rPr>
-          <w:rFonts w:ascii="Times New Roman" w:eastAsia="Times New Roman" w:hAnsi="Times New Roman" w:cs="Times New Roman"/>
-          <w:sz w:val="24"/>
-          <w:szCs w:val="24"/>
-          <w:lang w:eastAsia="en-IN"/>
-        </w:rPr>
-      </w:pPr>
-      <w:r>
-        <w:rPr>
-          <w:rFonts w:ascii="Times New Roman" w:eastAsia="Times New Roman" w:hAnsi="Times New Roman" w:cs="Times New Roman"/>
-          <w:sz w:val="24"/>
-          <w:szCs w:val="24"/>
-          <w:lang w:eastAsia="en-IN"/>
-        </w:rPr>
-        <w:t>Both application images were available inside the Minikube environment.</w:t>
+      <w:proofErr w:type="spellStart"/>
+      <w:r>
+        <w:rPr>
+          <w:rFonts w:ascii="Courier New" w:eastAsia="Times New Roman" w:hAnsi="Courier New" w:cs="Courier New"/>
+          <w:sz w:val="20"/>
+          <w:szCs w:val="20"/>
+          <w:lang w:eastAsia="en-IN"/>
+        </w:rPr>
+        <w:t>minikube</w:t>
+      </w:r>
+      <w:proofErr w:type="spellEnd"/>
+      <w:r>
+        <w:rPr>
+          <w:rFonts w:ascii="Courier New" w:eastAsia="Times New Roman" w:hAnsi="Courier New" w:cs="Courier New"/>
+          <w:sz w:val="20"/>
+          <w:szCs w:val="20"/>
+          <w:lang w:eastAsia="en-IN"/>
+        </w:rPr>
+        <w:t xml:space="preserve"> image ls</w:t>
+      </w:r>
+    </w:p>
+    <w:p>
+      <w:pPr>
+        <w:spacing w:before="100" w:beforeAutospacing="1" w:after="100" w:afterAutospacing="1" w:line="240" w:lineRule="auto"/>
+        <w:rPr>
+          <w:rFonts w:ascii="Times New Roman" w:eastAsia="Times New Roman" w:hAnsi="Times New Roman" w:cs="Times New Roman"/>
+          <w:sz w:val="24"/>
+          <w:szCs w:val="24"/>
+          <w:lang w:eastAsia="en-IN"/>
+        </w:rPr>
+      </w:pPr>
+      <w:r>
+        <w:rPr>
+          <w:rFonts w:ascii="Times New Roman" w:eastAsia="Times New Roman" w:hAnsi="Times New Roman" w:cs="Times New Roman"/>
+          <w:sz w:val="24"/>
+          <w:szCs w:val="24"/>
+          <w:lang w:eastAsia="en-IN"/>
+        </w:rPr>
+        <w:t xml:space="preserve">Both application images were available inside the </w:t>
+      </w:r>
+      <w:proofErr w:type="spellStart"/>
+      <w:r>
+        <w:rPr>
+          <w:rFonts w:ascii="Times New Roman" w:eastAsia="Times New Roman" w:hAnsi="Times New Roman" w:cs="Times New Roman"/>
+          <w:sz w:val="24"/>
+          <w:szCs w:val="24"/>
+          <w:lang w:eastAsia="en-IN"/>
+        </w:rPr>
+        <w:t>Minikube</w:t>
+      </w:r>
+      <w:proofErr w:type="spellEnd"/>
+      <w:r>
+        <w:rPr>
+          <w:rFonts w:ascii="Times New Roman" w:eastAsia="Times New Roman" w:hAnsi="Times New Roman" w:cs="Times New Roman"/>
+          <w:sz w:val="24"/>
+          <w:szCs w:val="24"/>
+          <w:lang w:eastAsia="en-IN"/>
+        </w:rPr>
+        <w:t xml:space="preserve"> environment.</w:t>
       </w:r>
     </w:p>
     <w:p>
@@ -3034,7 +3530,27 @@
           <w:szCs w:val="24"/>
           <w:lang w:eastAsia="en-IN"/>
         </w:rPr>
-        <w:t xml:space="preserve"> Minikube image list showing both application images.</w:t>
+        <w:t xml:space="preserve"> </w:t>
+      </w:r>
+      <w:proofErr w:type="spellStart"/>
+      <w:r>
+        <w:rPr>
+          <w:rFonts w:ascii="Times New Roman" w:eastAsia="Times New Roman" w:hAnsi="Times New Roman" w:cs="Times New Roman"/>
+          <w:sz w:val="24"/>
+          <w:szCs w:val="24"/>
+          <w:lang w:eastAsia="en-IN"/>
+        </w:rPr>
+        <w:t>Minikube</w:t>
+      </w:r>
+      <w:proofErr w:type="spellEnd"/>
+      <w:r>
+        <w:rPr>
+          <w:rFonts w:ascii="Times New Roman" w:eastAsia="Times New Roman" w:hAnsi="Times New Roman" w:cs="Times New Roman"/>
+          <w:sz w:val="24"/>
+          <w:szCs w:val="24"/>
+          <w:lang w:eastAsia="en-IN"/>
+        </w:rPr>
+        <w:t xml:space="preserve"> image list showing both application images.</w:t>
       </w:r>
     </w:p>
     <w:p>
@@ -3142,8 +3658,19 @@
           <w:szCs w:val="20"/>
           <w:lang w:eastAsia="en-IN"/>
         </w:rPr>
-        <w:t>k8s/backend.yaml</w:t>
-      </w:r>
+        <w:t>k8s/</w:t>
+      </w:r>
+      <w:proofErr w:type="spellStart"/>
+      <w:r>
+        <w:rPr>
+          <w:rFonts w:ascii="Courier New" w:eastAsia="Times New Roman" w:hAnsi="Courier New" w:cs="Courier New"/>
+          <w:sz w:val="20"/>
+          <w:szCs w:val="20"/>
+          <w:lang w:eastAsia="en-IN"/>
+        </w:rPr>
+        <w:t>backend.yaml</w:t>
+      </w:r>
+      <w:proofErr w:type="spellEnd"/>
     </w:p>
     <w:p>
       <w:pPr>
@@ -3430,8 +3957,19 @@
           <w:szCs w:val="20"/>
           <w:lang w:eastAsia="en-IN"/>
         </w:rPr>
-        <w:t>Service Type: ClusterIP</w:t>
-      </w:r>
+        <w:t xml:space="preserve">Service Type: </w:t>
+      </w:r>
+      <w:proofErr w:type="spellStart"/>
+      <w:r>
+        <w:rPr>
+          <w:rFonts w:ascii="Courier New" w:eastAsia="Times New Roman" w:hAnsi="Courier New" w:cs="Courier New"/>
+          <w:sz w:val="20"/>
+          <w:szCs w:val="20"/>
+          <w:lang w:eastAsia="en-IN"/>
+        </w:rPr>
+        <w:t>ClusterIP</w:t>
+      </w:r>
+      <w:proofErr w:type="spellEnd"/>
     </w:p>
     <w:p>
       <w:pPr>
@@ -3528,6 +4066,7 @@
         </w:rPr>
         <w:t xml:space="preserve">The backend Service uses </w:t>
       </w:r>
+      <w:proofErr w:type="spellStart"/>
       <w:r>
         <w:rPr>
           <w:rFonts w:ascii="Times New Roman" w:eastAsia="Times New Roman" w:hAnsi="Times New Roman" w:cs="Times New Roman"/>
@@ -3539,6 +4078,7 @@
         </w:rPr>
         <w:t>ClusterIP</w:t>
       </w:r>
+      <w:proofErr w:type="spellEnd"/>
       <w:r>
         <w:rPr>
           <w:rFonts w:ascii="Times New Roman" w:eastAsia="Times New Roman" w:hAnsi="Times New Roman" w:cs="Times New Roman"/>
@@ -3653,8 +4193,19 @@
           <w:szCs w:val="20"/>
           <w:lang w:eastAsia="en-IN"/>
         </w:rPr>
-        <w:t>k8s/frontend.yaml</w:t>
-      </w:r>
+        <w:t>k8s/</w:t>
+      </w:r>
+      <w:proofErr w:type="spellStart"/>
+      <w:r>
+        <w:rPr>
+          <w:rFonts w:ascii="Courier New" w:eastAsia="Times New Roman" w:hAnsi="Courier New" w:cs="Courier New"/>
+          <w:sz w:val="20"/>
+          <w:szCs w:val="20"/>
+          <w:lang w:eastAsia="en-IN"/>
+        </w:rPr>
+        <w:t>frontend.yaml</w:t>
+      </w:r>
+      <w:proofErr w:type="spellEnd"/>
     </w:p>
     <w:p>
       <w:pPr>
@@ -3941,8 +4492,19 @@
           <w:szCs w:val="20"/>
           <w:lang w:eastAsia="en-IN"/>
         </w:rPr>
-        <w:t>Service Type: NodePort</w:t>
-      </w:r>
+        <w:t xml:space="preserve">Service Type: </w:t>
+      </w:r>
+      <w:proofErr w:type="spellStart"/>
+      <w:r>
+        <w:rPr>
+          <w:rFonts w:ascii="Courier New" w:eastAsia="Times New Roman" w:hAnsi="Courier New" w:cs="Courier New"/>
+          <w:sz w:val="20"/>
+          <w:szCs w:val="20"/>
+          <w:lang w:eastAsia="en-IN"/>
+        </w:rPr>
+        <w:t>NodePort</w:t>
+      </w:r>
+      <w:proofErr w:type="spellEnd"/>
     </w:p>
     <w:p>
       <w:pPr>
@@ -4039,6 +4601,7 @@
         </w:rPr>
         <w:t xml:space="preserve">The frontend uses </w:t>
       </w:r>
+      <w:proofErr w:type="spellStart"/>
       <w:r>
         <w:rPr>
           <w:rFonts w:ascii="Times New Roman" w:eastAsia="Times New Roman" w:hAnsi="Times New Roman" w:cs="Times New Roman"/>
@@ -4050,14 +4613,35 @@
         </w:rPr>
         <w:t>NodePort</w:t>
       </w:r>
-      <w:r>
-        <w:rPr>
-          <w:rFonts w:ascii="Times New Roman" w:eastAsia="Times New Roman" w:hAnsi="Times New Roman" w:cs="Times New Roman"/>
-          <w:sz w:val="24"/>
-          <w:szCs w:val="24"/>
-          <w:lang w:eastAsia="en-IN"/>
-        </w:rPr>
-        <w:t xml:space="preserve"> so that it can be accessed from the host machine through Minikube.</w:t>
+      <w:proofErr w:type="spellEnd"/>
+      <w:r>
+        <w:rPr>
+          <w:rFonts w:ascii="Times New Roman" w:eastAsia="Times New Roman" w:hAnsi="Times New Roman" w:cs="Times New Roman"/>
+          <w:sz w:val="24"/>
+          <w:szCs w:val="24"/>
+          <w:lang w:eastAsia="en-IN"/>
+        </w:rPr>
+        <w:t xml:space="preserve"> so that it can be accessed from the host machine through </w:t>
+      </w:r>
+      <w:proofErr w:type="spellStart"/>
+      <w:r>
+        <w:rPr>
+          <w:rFonts w:ascii="Times New Roman" w:eastAsia="Times New Roman" w:hAnsi="Times New Roman" w:cs="Times New Roman"/>
+          <w:sz w:val="24"/>
+          <w:szCs w:val="24"/>
+          <w:lang w:eastAsia="en-IN"/>
+        </w:rPr>
+        <w:t>Minikube</w:t>
+      </w:r>
+      <w:proofErr w:type="spellEnd"/>
+      <w:r>
+        <w:rPr>
+          <w:rFonts w:ascii="Times New Roman" w:eastAsia="Times New Roman" w:hAnsi="Times New Roman" w:cs="Times New Roman"/>
+          <w:sz w:val="24"/>
+          <w:szCs w:val="24"/>
+          <w:lang w:eastAsia="en-IN"/>
+        </w:rPr>
+        <w:t>.</w:t>
       </w:r>
     </w:p>
     <w:p>
@@ -4158,15 +4742,37 @@
           <w:lang w:eastAsia="en-IN"/>
         </w:rPr>
       </w:pPr>
-      <w:r>
-        <w:rPr>
-          <w:rFonts w:ascii="Courier New" w:eastAsia="Times New Roman" w:hAnsi="Courier New" w:cs="Courier New"/>
-          <w:sz w:val="20"/>
-          <w:szCs w:val="20"/>
-          <w:lang w:eastAsia="en-IN"/>
-        </w:rPr>
-        <w:t>kubectl apply -f .\k8s\backend.yaml</w:t>
-      </w:r>
+      <w:proofErr w:type="spellStart"/>
+      <w:r>
+        <w:rPr>
+          <w:rFonts w:ascii="Courier New" w:eastAsia="Times New Roman" w:hAnsi="Courier New" w:cs="Courier New"/>
+          <w:sz w:val="20"/>
+          <w:szCs w:val="20"/>
+          <w:lang w:eastAsia="en-IN"/>
+        </w:rPr>
+        <w:t>kubectl</w:t>
+      </w:r>
+      <w:proofErr w:type="spellEnd"/>
+      <w:r>
+        <w:rPr>
+          <w:rFonts w:ascii="Courier New" w:eastAsia="Times New Roman" w:hAnsi="Courier New" w:cs="Courier New"/>
+          <w:sz w:val="20"/>
+          <w:szCs w:val="20"/>
+          <w:lang w:eastAsia="en-IN"/>
+        </w:rPr>
+        <w:t xml:space="preserve"> apply -f .\k8s\</w:t>
+      </w:r>
+      <w:proofErr w:type="spellStart"/>
+      <w:r>
+        <w:rPr>
+          <w:rFonts w:ascii="Courier New" w:eastAsia="Times New Roman" w:hAnsi="Courier New" w:cs="Courier New"/>
+          <w:sz w:val="20"/>
+          <w:szCs w:val="20"/>
+          <w:lang w:eastAsia="en-IN"/>
+        </w:rPr>
+        <w:t>backend.yaml</w:t>
+      </w:r>
+      <w:proofErr w:type="spellEnd"/>
     </w:p>
     <w:p>
       <w:pPr>
@@ -4216,15 +4822,37 @@
           <w:lang w:eastAsia="en-IN"/>
         </w:rPr>
       </w:pPr>
-      <w:r>
-        <w:rPr>
-          <w:rFonts w:ascii="Courier New" w:eastAsia="Times New Roman" w:hAnsi="Courier New" w:cs="Courier New"/>
-          <w:sz w:val="20"/>
-          <w:szCs w:val="20"/>
-          <w:lang w:eastAsia="en-IN"/>
-        </w:rPr>
-        <w:t>kubectl apply -f .\k8s\frontend.yaml</w:t>
-      </w:r>
+      <w:proofErr w:type="spellStart"/>
+      <w:r>
+        <w:rPr>
+          <w:rFonts w:ascii="Courier New" w:eastAsia="Times New Roman" w:hAnsi="Courier New" w:cs="Courier New"/>
+          <w:sz w:val="20"/>
+          <w:szCs w:val="20"/>
+          <w:lang w:eastAsia="en-IN"/>
+        </w:rPr>
+        <w:t>kubectl</w:t>
+      </w:r>
+      <w:proofErr w:type="spellEnd"/>
+      <w:r>
+        <w:rPr>
+          <w:rFonts w:ascii="Courier New" w:eastAsia="Times New Roman" w:hAnsi="Courier New" w:cs="Courier New"/>
+          <w:sz w:val="20"/>
+          <w:szCs w:val="20"/>
+          <w:lang w:eastAsia="en-IN"/>
+        </w:rPr>
+        <w:t xml:space="preserve"> apply -f .\k8s\</w:t>
+      </w:r>
+      <w:proofErr w:type="spellStart"/>
+      <w:r>
+        <w:rPr>
+          <w:rFonts w:ascii="Courier New" w:eastAsia="Times New Roman" w:hAnsi="Courier New" w:cs="Courier New"/>
+          <w:sz w:val="20"/>
+          <w:szCs w:val="20"/>
+          <w:lang w:eastAsia="en-IN"/>
+        </w:rPr>
+        <w:t>frontend.yaml</w:t>
+      </w:r>
+      <w:proofErr w:type="spellEnd"/>
     </w:p>
     <w:p>
       <w:pPr>
@@ -4294,14 +4922,27 @@
           <w:lang w:eastAsia="en-IN"/>
         </w:rPr>
       </w:pPr>
-      <w:r>
-        <w:rPr>
-          <w:rFonts w:ascii="Courier New" w:eastAsia="Times New Roman" w:hAnsi="Courier New" w:cs="Courier New"/>
-          <w:sz w:val="20"/>
-          <w:szCs w:val="20"/>
-          <w:lang w:eastAsia="en-IN"/>
-        </w:rPr>
-        <w:t>deployment.apps/flask-backend created</w:t>
+      <w:proofErr w:type="spellStart"/>
+      <w:proofErr w:type="gramStart"/>
+      <w:r>
+        <w:rPr>
+          <w:rFonts w:ascii="Courier New" w:eastAsia="Times New Roman" w:hAnsi="Courier New" w:cs="Courier New"/>
+          <w:sz w:val="20"/>
+          <w:szCs w:val="20"/>
+          <w:lang w:eastAsia="en-IN"/>
+        </w:rPr>
+        <w:t>deployment.apps</w:t>
+      </w:r>
+      <w:proofErr w:type="spellEnd"/>
+      <w:proofErr w:type="gramEnd"/>
+      <w:r>
+        <w:rPr>
+          <w:rFonts w:ascii="Courier New" w:eastAsia="Times New Roman" w:hAnsi="Courier New" w:cs="Courier New"/>
+          <w:sz w:val="20"/>
+          <w:szCs w:val="20"/>
+          <w:lang w:eastAsia="en-IN"/>
+        </w:rPr>
+        <w:t>/flask-backend created</w:t>
       </w:r>
     </w:p>
     <w:p>
@@ -4370,14 +5011,27 @@
           <w:lang w:eastAsia="en-IN"/>
         </w:rPr>
       </w:pPr>
-      <w:r>
-        <w:rPr>
-          <w:rFonts w:ascii="Courier New" w:eastAsia="Times New Roman" w:hAnsi="Courier New" w:cs="Courier New"/>
-          <w:sz w:val="20"/>
-          <w:szCs w:val="20"/>
-          <w:lang w:eastAsia="en-IN"/>
-        </w:rPr>
-        <w:t>deployment.apps/node-frontend created</w:t>
+      <w:proofErr w:type="spellStart"/>
+      <w:proofErr w:type="gramStart"/>
+      <w:r>
+        <w:rPr>
+          <w:rFonts w:ascii="Courier New" w:eastAsia="Times New Roman" w:hAnsi="Courier New" w:cs="Courier New"/>
+          <w:sz w:val="20"/>
+          <w:szCs w:val="20"/>
+          <w:lang w:eastAsia="en-IN"/>
+        </w:rPr>
+        <w:t>deployment.apps</w:t>
+      </w:r>
+      <w:proofErr w:type="spellEnd"/>
+      <w:proofErr w:type="gramEnd"/>
+      <w:r>
+        <w:rPr>
+          <w:rFonts w:ascii="Courier New" w:eastAsia="Times New Roman" w:hAnsi="Courier New" w:cs="Courier New"/>
+          <w:sz w:val="20"/>
+          <w:szCs w:val="20"/>
+          <w:lang w:eastAsia="en-IN"/>
+        </w:rPr>
+        <w:t>/node-frontend created</w:t>
       </w:r>
     </w:p>
     <w:p>
@@ -4448,14 +5102,25 @@
         </w:rPr>
         <w:t xml:space="preserve"> Successful </w:t>
       </w:r>
-      <w:r>
-        <w:rPr>
-          <w:rFonts w:ascii="Courier New" w:eastAsia="Times New Roman" w:hAnsi="Courier New" w:cs="Courier New"/>
-          <w:sz w:val="20"/>
-          <w:szCs w:val="20"/>
-          <w:lang w:eastAsia="en-IN"/>
-        </w:rPr>
-        <w:t>kubectl apply</w:t>
+      <w:proofErr w:type="spellStart"/>
+      <w:r>
+        <w:rPr>
+          <w:rFonts w:ascii="Courier New" w:eastAsia="Times New Roman" w:hAnsi="Courier New" w:cs="Courier New"/>
+          <w:sz w:val="20"/>
+          <w:szCs w:val="20"/>
+          <w:lang w:eastAsia="en-IN"/>
+        </w:rPr>
+        <w:t>kubectl</w:t>
+      </w:r>
+      <w:proofErr w:type="spellEnd"/>
+      <w:r>
+        <w:rPr>
+          <w:rFonts w:ascii="Courier New" w:eastAsia="Times New Roman" w:hAnsi="Courier New" w:cs="Courier New"/>
+          <w:sz w:val="20"/>
+          <w:szCs w:val="20"/>
+          <w:lang w:eastAsia="en-IN"/>
+        </w:rPr>
+        <w:t xml:space="preserve"> apply</w:t>
       </w:r>
       <w:r>
         <w:rPr>
@@ -4564,14 +5229,25 @@
           <w:lang w:eastAsia="en-IN"/>
         </w:rPr>
       </w:pPr>
-      <w:r>
-        <w:rPr>
-          <w:rFonts w:ascii="Courier New" w:eastAsia="Times New Roman" w:hAnsi="Courier New" w:cs="Courier New"/>
-          <w:sz w:val="20"/>
-          <w:szCs w:val="20"/>
-          <w:lang w:eastAsia="en-IN"/>
-        </w:rPr>
-        <w:t>kubectl get pods</w:t>
+      <w:proofErr w:type="spellStart"/>
+      <w:r>
+        <w:rPr>
+          <w:rFonts w:ascii="Courier New" w:eastAsia="Times New Roman" w:hAnsi="Courier New" w:cs="Courier New"/>
+          <w:sz w:val="20"/>
+          <w:szCs w:val="20"/>
+          <w:lang w:eastAsia="en-IN"/>
+        </w:rPr>
+        <w:t>kubectl</w:t>
+      </w:r>
+      <w:proofErr w:type="spellEnd"/>
+      <w:r>
+        <w:rPr>
+          <w:rFonts w:ascii="Courier New" w:eastAsia="Times New Roman" w:hAnsi="Courier New" w:cs="Courier New"/>
+          <w:sz w:val="20"/>
+          <w:szCs w:val="20"/>
+          <w:lang w:eastAsia="en-IN"/>
+        </w:rPr>
+        <w:t xml:space="preserve"> get pods</w:t>
       </w:r>
     </w:p>
     <w:p>
@@ -4967,14 +5643,25 @@
           <w:lang w:eastAsia="en-IN"/>
         </w:rPr>
       </w:pPr>
-      <w:r>
-        <w:rPr>
-          <w:rFonts w:ascii="Courier New" w:eastAsia="Times New Roman" w:hAnsi="Courier New" w:cs="Courier New"/>
-          <w:sz w:val="20"/>
-          <w:szCs w:val="20"/>
-          <w:lang w:eastAsia="en-IN"/>
-        </w:rPr>
-        <w:t>kubectl get services</w:t>
+      <w:proofErr w:type="spellStart"/>
+      <w:r>
+        <w:rPr>
+          <w:rFonts w:ascii="Courier New" w:eastAsia="Times New Roman" w:hAnsi="Courier New" w:cs="Courier New"/>
+          <w:sz w:val="20"/>
+          <w:szCs w:val="20"/>
+          <w:lang w:eastAsia="en-IN"/>
+        </w:rPr>
+        <w:t>kubectl</w:t>
+      </w:r>
+      <w:proofErr w:type="spellEnd"/>
+      <w:r>
+        <w:rPr>
+          <w:rFonts w:ascii="Courier New" w:eastAsia="Times New Roman" w:hAnsi="Courier New" w:cs="Courier New"/>
+          <w:sz w:val="20"/>
+          <w:szCs w:val="20"/>
+          <w:lang w:eastAsia="en-IN"/>
+        </w:rPr>
+        <w:t xml:space="preserve"> get services</w:t>
       </w:r>
     </w:p>
     <w:p>
@@ -5070,7 +5757,27 @@
           <w:szCs w:val="20"/>
           <w:lang w:eastAsia="en-IN"/>
         </w:rPr>
-        <w:t>flask-backend-service   ClusterIP   10.102.69.70    &lt;none&gt;        5001/TCP</w:t>
+        <w:t xml:space="preserve">flask-backend-service   </w:t>
+      </w:r>
+      <w:proofErr w:type="spellStart"/>
+      <w:r>
+        <w:rPr>
+          <w:rFonts w:ascii="Courier New" w:eastAsia="Times New Roman" w:hAnsi="Courier New" w:cs="Courier New"/>
+          <w:sz w:val="20"/>
+          <w:szCs w:val="20"/>
+          <w:lang w:eastAsia="en-IN"/>
+        </w:rPr>
+        <w:t>ClusterIP</w:t>
+      </w:r>
+      <w:proofErr w:type="spellEnd"/>
+      <w:r>
+        <w:rPr>
+          <w:rFonts w:ascii="Courier New" w:eastAsia="Times New Roman" w:hAnsi="Courier New" w:cs="Courier New"/>
+          <w:sz w:val="20"/>
+          <w:szCs w:val="20"/>
+          <w:lang w:eastAsia="en-IN"/>
+        </w:rPr>
+        <w:t xml:space="preserve">   10.102.69.70    &lt;none&gt;        5001/TCP</w:t>
       </w:r>
     </w:p>
     <w:p>
@@ -5101,14 +5808,45 @@
           <w:lang w:eastAsia="en-IN"/>
         </w:rPr>
       </w:pPr>
-      <w:r>
-        <w:rPr>
-          <w:rFonts w:ascii="Courier New" w:eastAsia="Times New Roman" w:hAnsi="Courier New" w:cs="Courier New"/>
-          <w:sz w:val="20"/>
-          <w:szCs w:val="20"/>
-          <w:lang w:eastAsia="en-IN"/>
-        </w:rPr>
-        <w:t>kubernetes              ClusterIP   10.96.0.1       &lt;none&gt;        443/TCP</w:t>
+      <w:proofErr w:type="spellStart"/>
+      <w:r>
+        <w:rPr>
+          <w:rFonts w:ascii="Courier New" w:eastAsia="Times New Roman" w:hAnsi="Courier New" w:cs="Courier New"/>
+          <w:sz w:val="20"/>
+          <w:szCs w:val="20"/>
+          <w:lang w:eastAsia="en-IN"/>
+        </w:rPr>
+        <w:t>kubernetes</w:t>
+      </w:r>
+      <w:proofErr w:type="spellEnd"/>
+      <w:r>
+        <w:rPr>
+          <w:rFonts w:ascii="Courier New" w:eastAsia="Times New Roman" w:hAnsi="Courier New" w:cs="Courier New"/>
+          <w:sz w:val="20"/>
+          <w:szCs w:val="20"/>
+          <w:lang w:eastAsia="en-IN"/>
+        </w:rPr>
+        <w:t xml:space="preserve">              </w:t>
+      </w:r>
+      <w:proofErr w:type="spellStart"/>
+      <w:r>
+        <w:rPr>
+          <w:rFonts w:ascii="Courier New" w:eastAsia="Times New Roman" w:hAnsi="Courier New" w:cs="Courier New"/>
+          <w:sz w:val="20"/>
+          <w:szCs w:val="20"/>
+          <w:lang w:eastAsia="en-IN"/>
+        </w:rPr>
+        <w:t>ClusterIP</w:t>
+      </w:r>
+      <w:proofErr w:type="spellEnd"/>
+      <w:r>
+        <w:rPr>
+          <w:rFonts w:ascii="Courier New" w:eastAsia="Times New Roman" w:hAnsi="Courier New" w:cs="Courier New"/>
+          <w:sz w:val="20"/>
+          <w:szCs w:val="20"/>
+          <w:lang w:eastAsia="en-IN"/>
+        </w:rPr>
+        <w:t xml:space="preserve">   10.96.0.1       &lt;none&gt;        443/TCP</w:t>
       </w:r>
     </w:p>
     <w:p>
@@ -5146,28 +5884,69 @@
           <w:szCs w:val="20"/>
           <w:lang w:eastAsia="en-IN"/>
         </w:rPr>
-        <w:t>node-frontend-service   NodePort    10.102.70.187   &lt;none&gt;        3000:30402/TCP</w:t>
-      </w:r>
-    </w:p>
-    <w:p>
-      <w:pPr>
-        <w:spacing w:before="100" w:beforeAutospacing="1" w:after="100" w:afterAutospacing="1" w:line="240" w:lineRule="auto"/>
-        <w:rPr>
-          <w:rFonts w:ascii="Times New Roman" w:eastAsia="Times New Roman" w:hAnsi="Times New Roman" w:cs="Times New Roman"/>
-          <w:sz w:val="24"/>
-          <w:szCs w:val="24"/>
-          <w:lang w:eastAsia="en-IN"/>
-        </w:rPr>
-      </w:pPr>
-      <w:r>
-        <w:rPr>
-          <w:rFonts w:ascii="Times New Roman" w:eastAsia="Times New Roman" w:hAnsi="Times New Roman" w:cs="Times New Roman"/>
-          <w:sz w:val="24"/>
-          <w:szCs w:val="24"/>
-          <w:lang w:eastAsia="en-IN"/>
-        </w:rPr>
-        <w:t xml:space="preserve">The Flask backend Service was successfully created as a </w:t>
-      </w:r>
+        <w:t xml:space="preserve">node-frontend-service   </w:t>
+      </w:r>
+      <w:proofErr w:type="spellStart"/>
+      <w:r>
+        <w:rPr>
+          <w:rFonts w:ascii="Courier New" w:eastAsia="Times New Roman" w:hAnsi="Courier New" w:cs="Courier New"/>
+          <w:sz w:val="20"/>
+          <w:szCs w:val="20"/>
+          <w:lang w:eastAsia="en-IN"/>
+        </w:rPr>
+        <w:t>NodePort</w:t>
+      </w:r>
+      <w:proofErr w:type="spellEnd"/>
+      <w:r>
+        <w:rPr>
+          <w:rFonts w:ascii="Courier New" w:eastAsia="Times New Roman" w:hAnsi="Courier New" w:cs="Courier New"/>
+          <w:sz w:val="20"/>
+          <w:szCs w:val="20"/>
+          <w:lang w:eastAsia="en-IN"/>
+        </w:rPr>
+        <w:t xml:space="preserve">    10.102.70.187   &lt;none&gt;        3000:30402/TCP</w:t>
+      </w:r>
+    </w:p>
+    <w:p>
+      <w:pPr>
+        <w:spacing w:before="100" w:beforeAutospacing="1" w:after="100" w:afterAutospacing="1" w:line="240" w:lineRule="auto"/>
+        <w:rPr>
+          <w:rFonts w:ascii="Times New Roman" w:eastAsia="Times New Roman" w:hAnsi="Times New Roman" w:cs="Times New Roman"/>
+          <w:sz w:val="24"/>
+          <w:szCs w:val="24"/>
+          <w:lang w:eastAsia="en-IN"/>
+        </w:rPr>
+      </w:pPr>
+      <w:r>
+        <w:rPr>
+          <w:rFonts w:ascii="Times New Roman" w:eastAsia="Times New Roman" w:hAnsi="Times New Roman" w:cs="Times New Roman"/>
+          <w:sz w:val="24"/>
+          <w:szCs w:val="24"/>
+          <w:lang w:eastAsia="en-IN"/>
+        </w:rPr>
+        <w:t xml:space="preserve">The Flask </w:t>
+      </w:r>
+      <w:proofErr w:type="gramStart"/>
+      <w:r>
+        <w:rPr>
+          <w:rFonts w:ascii="Times New Roman" w:eastAsia="Times New Roman" w:hAnsi="Times New Roman" w:cs="Times New Roman"/>
+          <w:sz w:val="24"/>
+          <w:szCs w:val="24"/>
+          <w:lang w:eastAsia="en-IN"/>
+        </w:rPr>
+        <w:t>backend</w:t>
+      </w:r>
+      <w:proofErr w:type="gramEnd"/>
+      <w:r>
+        <w:rPr>
+          <w:rFonts w:ascii="Times New Roman" w:eastAsia="Times New Roman" w:hAnsi="Times New Roman" w:cs="Times New Roman"/>
+          <w:sz w:val="24"/>
+          <w:szCs w:val="24"/>
+          <w:lang w:eastAsia="en-IN"/>
+        </w:rPr>
+        <w:t xml:space="preserve"> Service was successfully created as a </w:t>
+      </w:r>
+      <w:proofErr w:type="spellStart"/>
       <w:r>
         <w:rPr>
           <w:rFonts w:ascii="Times New Roman" w:eastAsia="Times New Roman" w:hAnsi="Times New Roman" w:cs="Times New Roman"/>
@@ -5179,6 +5958,7 @@
         </w:rPr>
         <w:t>ClusterIP</w:t>
       </w:r>
+      <w:proofErr w:type="spellEnd"/>
       <w:r>
         <w:rPr>
           <w:rFonts w:ascii="Times New Roman" w:eastAsia="Times New Roman" w:hAnsi="Times New Roman" w:cs="Times New Roman"/>
@@ -5226,6 +6006,7 @@
         </w:rPr>
         <w:t xml:space="preserve">The Node.js frontend Service was successfully created as a </w:t>
       </w:r>
+      <w:proofErr w:type="spellStart"/>
       <w:r>
         <w:rPr>
           <w:rFonts w:ascii="Times New Roman" w:eastAsia="Times New Roman" w:hAnsi="Times New Roman" w:cs="Times New Roman"/>
@@ -5237,6 +6018,7 @@
         </w:rPr>
         <w:t>NodePort</w:t>
       </w:r>
+      <w:proofErr w:type="spellEnd"/>
       <w:r>
         <w:rPr>
           <w:rFonts w:ascii="Times New Roman" w:eastAsia="Times New Roman" w:hAnsi="Times New Roman" w:cs="Times New Roman"/>
@@ -5264,7 +6046,27 @@
           <w:szCs w:val="24"/>
           <w:lang w:eastAsia="en-IN"/>
         </w:rPr>
-        <w:t>The frontend was assigned NodePort:</w:t>
+        <w:t xml:space="preserve">The frontend was assigned </w:t>
+      </w:r>
+      <w:proofErr w:type="spellStart"/>
+      <w:r>
+        <w:rPr>
+          <w:rFonts w:ascii="Times New Roman" w:eastAsia="Times New Roman" w:hAnsi="Times New Roman" w:cs="Times New Roman"/>
+          <w:sz w:val="24"/>
+          <w:szCs w:val="24"/>
+          <w:lang w:eastAsia="en-IN"/>
+        </w:rPr>
+        <w:t>NodePort</w:t>
+      </w:r>
+      <w:proofErr w:type="spellEnd"/>
+      <w:r>
+        <w:rPr>
+          <w:rFonts w:ascii="Times New Roman" w:eastAsia="Times New Roman" w:hAnsi="Times New Roman" w:cs="Times New Roman"/>
+          <w:sz w:val="24"/>
+          <w:szCs w:val="24"/>
+          <w:lang w:eastAsia="en-IN"/>
+        </w:rPr>
+        <w:t>:</w:t>
       </w:r>
     </w:p>
     <w:p>
@@ -5333,7 +6135,47 @@
           <w:szCs w:val="24"/>
           <w:lang w:eastAsia="en-IN"/>
         </w:rPr>
-        <w:t xml:space="preserve"> Kubernetes Services showing the backend ClusterIP and frontend NodePort.</w:t>
+        <w:t xml:space="preserve"> Kubernetes Services showing the backend </w:t>
+      </w:r>
+      <w:proofErr w:type="spellStart"/>
+      <w:r>
+        <w:rPr>
+          <w:rFonts w:ascii="Times New Roman" w:eastAsia="Times New Roman" w:hAnsi="Times New Roman" w:cs="Times New Roman"/>
+          <w:sz w:val="24"/>
+          <w:szCs w:val="24"/>
+          <w:lang w:eastAsia="en-IN"/>
+        </w:rPr>
+        <w:t>ClusterIP</w:t>
+      </w:r>
+      <w:proofErr w:type="spellEnd"/>
+      <w:r>
+        <w:rPr>
+          <w:rFonts w:ascii="Times New Roman" w:eastAsia="Times New Roman" w:hAnsi="Times New Roman" w:cs="Times New Roman"/>
+          <w:sz w:val="24"/>
+          <w:szCs w:val="24"/>
+          <w:lang w:eastAsia="en-IN"/>
+        </w:rPr>
+        <w:t xml:space="preserve"> and frontend </w:t>
+      </w:r>
+      <w:proofErr w:type="spellStart"/>
+      <w:r>
+        <w:rPr>
+          <w:rFonts w:ascii="Times New Roman" w:eastAsia="Times New Roman" w:hAnsi="Times New Roman" w:cs="Times New Roman"/>
+          <w:sz w:val="24"/>
+          <w:szCs w:val="24"/>
+          <w:lang w:eastAsia="en-IN"/>
+        </w:rPr>
+        <w:t>NodePort</w:t>
+      </w:r>
+      <w:proofErr w:type="spellEnd"/>
+      <w:r>
+        <w:rPr>
+          <w:rFonts w:ascii="Times New Roman" w:eastAsia="Times New Roman" w:hAnsi="Times New Roman" w:cs="Times New Roman"/>
+          <w:sz w:val="24"/>
+          <w:szCs w:val="24"/>
+          <w:lang w:eastAsia="en-IN"/>
+        </w:rPr>
+        <w:t>.</w:t>
       </w:r>
     </w:p>
     <w:p>
@@ -5433,34 +6275,76 @@
           <w:lang w:eastAsia="en-IN"/>
         </w:rPr>
       </w:pPr>
-      <w:r>
-        <w:rPr>
-          <w:rFonts w:ascii="Courier New" w:eastAsia="Times New Roman" w:hAnsi="Courier New" w:cs="Courier New"/>
-          <w:sz w:val="20"/>
-          <w:szCs w:val="20"/>
-          <w:lang w:eastAsia="en-IN"/>
-        </w:rPr>
-        <w:t>minikube service node-frontend-service --url</w:t>
-      </w:r>
-    </w:p>
-    <w:p>
-      <w:pPr>
-        <w:spacing w:before="100" w:beforeAutospacing="1" w:after="100" w:afterAutospacing="1" w:line="240" w:lineRule="auto"/>
-        <w:rPr>
-          <w:rFonts w:ascii="Times New Roman" w:eastAsia="Times New Roman" w:hAnsi="Times New Roman" w:cs="Times New Roman"/>
-          <w:sz w:val="24"/>
-          <w:szCs w:val="24"/>
-          <w:lang w:eastAsia="en-IN"/>
-        </w:rPr>
-      </w:pPr>
-      <w:r>
-        <w:rPr>
-          <w:rFonts w:ascii="Times New Roman" w:eastAsia="Times New Roman" w:hAnsi="Times New Roman" w:cs="Times New Roman"/>
-          <w:sz w:val="24"/>
-          <w:szCs w:val="24"/>
-          <w:lang w:eastAsia="en-IN"/>
-        </w:rPr>
-        <w:t>The generated Minikube URL was opened in Google Chrome.</w:t>
+      <w:proofErr w:type="spellStart"/>
+      <w:r>
+        <w:rPr>
+          <w:rFonts w:ascii="Courier New" w:eastAsia="Times New Roman" w:hAnsi="Courier New" w:cs="Courier New"/>
+          <w:sz w:val="20"/>
+          <w:szCs w:val="20"/>
+          <w:lang w:eastAsia="en-IN"/>
+        </w:rPr>
+        <w:t>minikube</w:t>
+      </w:r>
+      <w:proofErr w:type="spellEnd"/>
+      <w:r>
+        <w:rPr>
+          <w:rFonts w:ascii="Courier New" w:eastAsia="Times New Roman" w:hAnsi="Courier New" w:cs="Courier New"/>
+          <w:sz w:val="20"/>
+          <w:szCs w:val="20"/>
+          <w:lang w:eastAsia="en-IN"/>
+        </w:rPr>
+        <w:t xml:space="preserve"> service node-frontend-service --</w:t>
+      </w:r>
+      <w:proofErr w:type="spellStart"/>
+      <w:r>
+        <w:rPr>
+          <w:rFonts w:ascii="Courier New" w:eastAsia="Times New Roman" w:hAnsi="Courier New" w:cs="Courier New"/>
+          <w:sz w:val="20"/>
+          <w:szCs w:val="20"/>
+          <w:lang w:eastAsia="en-IN"/>
+        </w:rPr>
+        <w:t>url</w:t>
+      </w:r>
+      <w:proofErr w:type="spellEnd"/>
+    </w:p>
+    <w:p>
+      <w:pPr>
+        <w:spacing w:before="100" w:beforeAutospacing="1" w:after="100" w:afterAutospacing="1" w:line="240" w:lineRule="auto"/>
+        <w:rPr>
+          <w:rFonts w:ascii="Times New Roman" w:eastAsia="Times New Roman" w:hAnsi="Times New Roman" w:cs="Times New Roman"/>
+          <w:sz w:val="24"/>
+          <w:szCs w:val="24"/>
+          <w:lang w:eastAsia="en-IN"/>
+        </w:rPr>
+      </w:pPr>
+      <w:r>
+        <w:rPr>
+          <w:rFonts w:ascii="Times New Roman" w:eastAsia="Times New Roman" w:hAnsi="Times New Roman" w:cs="Times New Roman"/>
+          <w:sz w:val="24"/>
+          <w:szCs w:val="24"/>
+          <w:lang w:eastAsia="en-IN"/>
+        </w:rPr>
+        <w:t xml:space="preserve">The generated </w:t>
+      </w:r>
+      <w:proofErr w:type="spellStart"/>
+      <w:r>
+        <w:rPr>
+          <w:rFonts w:ascii="Times New Roman" w:eastAsia="Times New Roman" w:hAnsi="Times New Roman" w:cs="Times New Roman"/>
+          <w:sz w:val="24"/>
+          <w:szCs w:val="24"/>
+          <w:lang w:eastAsia="en-IN"/>
+        </w:rPr>
+        <w:t>Minikube</w:t>
+      </w:r>
+      <w:proofErr w:type="spellEnd"/>
+      <w:r>
+        <w:rPr>
+          <w:rFonts w:ascii="Times New Roman" w:eastAsia="Times New Roman" w:hAnsi="Times New Roman" w:cs="Times New Roman"/>
+          <w:sz w:val="24"/>
+          <w:szCs w:val="24"/>
+          <w:lang w:eastAsia="en-IN"/>
+        </w:rPr>
+        <w:t xml:space="preserve"> URL was opened in Google Chrome.</w:t>
       </w:r>
     </w:p>
     <w:p>
@@ -5511,14 +6395,25 @@
           <w:lang w:eastAsia="en-IN"/>
         </w:rPr>
       </w:pPr>
-      <w:r>
-        <w:rPr>
-          <w:rFonts w:ascii="Courier New" w:eastAsia="Times New Roman" w:hAnsi="Courier New" w:cs="Courier New"/>
-          <w:sz w:val="20"/>
-          <w:szCs w:val="20"/>
-          <w:lang w:eastAsia="en-IN"/>
-        </w:rPr>
-        <w:t>Tutedude Node.js Frontend is running successfully!</w:t>
+      <w:proofErr w:type="spellStart"/>
+      <w:r>
+        <w:rPr>
+          <w:rFonts w:ascii="Courier New" w:eastAsia="Times New Roman" w:hAnsi="Courier New" w:cs="Courier New"/>
+          <w:sz w:val="20"/>
+          <w:szCs w:val="20"/>
+          <w:lang w:eastAsia="en-IN"/>
+        </w:rPr>
+        <w:t>Tutedude</w:t>
+      </w:r>
+      <w:proofErr w:type="spellEnd"/>
+      <w:r>
+        <w:rPr>
+          <w:rFonts w:ascii="Courier New" w:eastAsia="Times New Roman" w:hAnsi="Courier New" w:cs="Courier New"/>
+          <w:sz w:val="20"/>
+          <w:szCs w:val="20"/>
+          <w:lang w:eastAsia="en-IN"/>
+        </w:rPr>
+        <w:t xml:space="preserve"> Node.js Frontend is running successfully!</w:t>
       </w:r>
     </w:p>
     <w:p>
@@ -5638,7 +6533,27 @@
           <w:szCs w:val="24"/>
           <w:lang w:eastAsia="en-IN"/>
         </w:rPr>
-        <w:t>The Flask backend Service was accessed using Kubernetes port forwarding:</w:t>
+        <w:t xml:space="preserve">The Flask </w:t>
+      </w:r>
+      <w:proofErr w:type="gramStart"/>
+      <w:r>
+        <w:rPr>
+          <w:rFonts w:ascii="Times New Roman" w:eastAsia="Times New Roman" w:hAnsi="Times New Roman" w:cs="Times New Roman"/>
+          <w:sz w:val="24"/>
+          <w:szCs w:val="24"/>
+          <w:lang w:eastAsia="en-IN"/>
+        </w:rPr>
+        <w:t>backend</w:t>
+      </w:r>
+      <w:proofErr w:type="gramEnd"/>
+      <w:r>
+        <w:rPr>
+          <w:rFonts w:ascii="Times New Roman" w:eastAsia="Times New Roman" w:hAnsi="Times New Roman" w:cs="Times New Roman"/>
+          <w:sz w:val="24"/>
+          <w:szCs w:val="24"/>
+          <w:lang w:eastAsia="en-IN"/>
+        </w:rPr>
+        <w:t xml:space="preserve"> Service was accessed using Kubernetes port forwarding:</w:t>
       </w:r>
     </w:p>
     <w:p>
@@ -5669,14 +6584,25 @@
           <w:lang w:eastAsia="en-IN"/>
         </w:rPr>
       </w:pPr>
-      <w:r>
-        <w:rPr>
-          <w:rFonts w:ascii="Courier New" w:eastAsia="Times New Roman" w:hAnsi="Courier New" w:cs="Courier New"/>
-          <w:sz w:val="20"/>
-          <w:szCs w:val="20"/>
-          <w:lang w:eastAsia="en-IN"/>
-        </w:rPr>
-        <w:t>kubectl port-forward service/flask-backend-service 5001:5001</w:t>
+      <w:proofErr w:type="spellStart"/>
+      <w:r>
+        <w:rPr>
+          <w:rFonts w:ascii="Courier New" w:eastAsia="Times New Roman" w:hAnsi="Courier New" w:cs="Courier New"/>
+          <w:sz w:val="20"/>
+          <w:szCs w:val="20"/>
+          <w:lang w:eastAsia="en-IN"/>
+        </w:rPr>
+        <w:t>kubectl</w:t>
+      </w:r>
+      <w:proofErr w:type="spellEnd"/>
+      <w:r>
+        <w:rPr>
+          <w:rFonts w:ascii="Courier New" w:eastAsia="Times New Roman" w:hAnsi="Courier New" w:cs="Courier New"/>
+          <w:sz w:val="20"/>
+          <w:szCs w:val="20"/>
+          <w:lang w:eastAsia="en-IN"/>
+        </w:rPr>
+        <w:t xml:space="preserve"> port-forward service/flask-backend-service 5001:5001</w:t>
       </w:r>
     </w:p>
     <w:p>
@@ -5944,14 +6870,25 @@
           <w:lang w:eastAsia="en-IN"/>
         </w:rPr>
       </w:pPr>
-      <w:r>
-        <w:rPr>
-          <w:rFonts w:ascii="Courier New" w:eastAsia="Times New Roman" w:hAnsi="Courier New" w:cs="Courier New"/>
-          <w:sz w:val="20"/>
-          <w:szCs w:val="20"/>
-          <w:lang w:eastAsia="en-IN"/>
-        </w:rPr>
-        <w:t>kubectl get deployments</w:t>
+      <w:proofErr w:type="spellStart"/>
+      <w:r>
+        <w:rPr>
+          <w:rFonts w:ascii="Courier New" w:eastAsia="Times New Roman" w:hAnsi="Courier New" w:cs="Courier New"/>
+          <w:sz w:val="20"/>
+          <w:szCs w:val="20"/>
+          <w:lang w:eastAsia="en-IN"/>
+        </w:rPr>
+        <w:t>kubectl</w:t>
+      </w:r>
+      <w:proofErr w:type="spellEnd"/>
+      <w:r>
+        <w:rPr>
+          <w:rFonts w:ascii="Courier New" w:eastAsia="Times New Roman" w:hAnsi="Courier New" w:cs="Courier New"/>
+          <w:sz w:val="20"/>
+          <w:szCs w:val="20"/>
+          <w:lang w:eastAsia="en-IN"/>
+        </w:rPr>
+        <w:t xml:space="preserve"> get deployments</w:t>
       </w:r>
     </w:p>
     <w:p>
@@ -6136,34 +7073,65 @@
           <w:lang w:eastAsia="en-IN"/>
         </w:rPr>
       </w:pPr>
-      <w:r>
-        <w:rPr>
-          <w:rFonts w:ascii="Courier New" w:eastAsia="Times New Roman" w:hAnsi="Courier New" w:cs="Courier New"/>
-          <w:sz w:val="20"/>
-          <w:szCs w:val="20"/>
-          <w:lang w:eastAsia="en-IN"/>
-        </w:rPr>
-        <w:t>kubectl get pods</w:t>
-      </w:r>
-    </w:p>
-    <w:p>
-      <w:pPr>
-        <w:spacing w:before="100" w:beforeAutospacing="1" w:after="100" w:afterAutospacing="1" w:line="240" w:lineRule="auto"/>
-        <w:rPr>
-          <w:rFonts w:ascii="Times New Roman" w:eastAsia="Times New Roman" w:hAnsi="Times New Roman" w:cs="Times New Roman"/>
-          <w:sz w:val="24"/>
-          <w:szCs w:val="24"/>
-          <w:lang w:eastAsia="en-IN"/>
-        </w:rPr>
-      </w:pPr>
-      <w:r>
-        <w:rPr>
-          <w:rFonts w:ascii="Times New Roman" w:eastAsia="Times New Roman" w:hAnsi="Times New Roman" w:cs="Times New Roman"/>
-          <w:sz w:val="24"/>
-          <w:szCs w:val="24"/>
-          <w:lang w:eastAsia="en-IN"/>
-        </w:rPr>
-        <w:t>The result confirmed that both application Pods were Running.</w:t>
+      <w:proofErr w:type="spellStart"/>
+      <w:r>
+        <w:rPr>
+          <w:rFonts w:ascii="Courier New" w:eastAsia="Times New Roman" w:hAnsi="Courier New" w:cs="Courier New"/>
+          <w:sz w:val="20"/>
+          <w:szCs w:val="20"/>
+          <w:lang w:eastAsia="en-IN"/>
+        </w:rPr>
+        <w:t>kubectl</w:t>
+      </w:r>
+      <w:proofErr w:type="spellEnd"/>
+      <w:r>
+        <w:rPr>
+          <w:rFonts w:ascii="Courier New" w:eastAsia="Times New Roman" w:hAnsi="Courier New" w:cs="Courier New"/>
+          <w:sz w:val="20"/>
+          <w:szCs w:val="20"/>
+          <w:lang w:eastAsia="en-IN"/>
+        </w:rPr>
+        <w:t xml:space="preserve"> get pods</w:t>
+      </w:r>
+    </w:p>
+    <w:p>
+      <w:pPr>
+        <w:spacing w:before="100" w:beforeAutospacing="1" w:after="100" w:afterAutospacing="1" w:line="240" w:lineRule="auto"/>
+        <w:rPr>
+          <w:rFonts w:ascii="Times New Roman" w:eastAsia="Times New Roman" w:hAnsi="Times New Roman" w:cs="Times New Roman"/>
+          <w:sz w:val="24"/>
+          <w:szCs w:val="24"/>
+          <w:lang w:eastAsia="en-IN"/>
+        </w:rPr>
+      </w:pPr>
+      <w:r>
+        <w:rPr>
+          <w:rFonts w:ascii="Times New Roman" w:eastAsia="Times New Roman" w:hAnsi="Times New Roman" w:cs="Times New Roman"/>
+          <w:sz w:val="24"/>
+          <w:szCs w:val="24"/>
+          <w:lang w:eastAsia="en-IN"/>
+        </w:rPr>
+        <w:t xml:space="preserve">The result confirmed that both application Pods </w:t>
+      </w:r>
+      <w:proofErr w:type="gramStart"/>
+      <w:r>
+        <w:rPr>
+          <w:rFonts w:ascii="Times New Roman" w:eastAsia="Times New Roman" w:hAnsi="Times New Roman" w:cs="Times New Roman"/>
+          <w:sz w:val="24"/>
+          <w:szCs w:val="24"/>
+          <w:lang w:eastAsia="en-IN"/>
+        </w:rPr>
+        <w:t>were</w:t>
+      </w:r>
+      <w:proofErr w:type="gramEnd"/>
+      <w:r>
+        <w:rPr>
+          <w:rFonts w:ascii="Times New Roman" w:eastAsia="Times New Roman" w:hAnsi="Times New Roman" w:cs="Times New Roman"/>
+          <w:sz w:val="24"/>
+          <w:szCs w:val="24"/>
+          <w:lang w:eastAsia="en-IN"/>
+        </w:rPr>
+        <w:t xml:space="preserve"> Running.</w:t>
       </w:r>
     </w:p>
     <w:p>
@@ -6214,14 +7182,25 @@
           <w:lang w:eastAsia="en-IN"/>
         </w:rPr>
       </w:pPr>
-      <w:r>
-        <w:rPr>
-          <w:rFonts w:ascii="Courier New" w:eastAsia="Times New Roman" w:hAnsi="Courier New" w:cs="Courier New"/>
-          <w:sz w:val="20"/>
-          <w:szCs w:val="20"/>
-          <w:lang w:eastAsia="en-IN"/>
-        </w:rPr>
-        <w:t>kubectl get services</w:t>
+      <w:proofErr w:type="spellStart"/>
+      <w:r>
+        <w:rPr>
+          <w:rFonts w:ascii="Courier New" w:eastAsia="Times New Roman" w:hAnsi="Courier New" w:cs="Courier New"/>
+          <w:sz w:val="20"/>
+          <w:szCs w:val="20"/>
+          <w:lang w:eastAsia="en-IN"/>
+        </w:rPr>
+        <w:t>kubectl</w:t>
+      </w:r>
+      <w:proofErr w:type="spellEnd"/>
+      <w:r>
+        <w:rPr>
+          <w:rFonts w:ascii="Courier New" w:eastAsia="Times New Roman" w:hAnsi="Courier New" w:cs="Courier New"/>
+          <w:sz w:val="20"/>
+          <w:szCs w:val="20"/>
+          <w:lang w:eastAsia="en-IN"/>
+        </w:rPr>
+        <w:t xml:space="preserve"> get services</w:t>
       </w:r>
     </w:p>
     <w:p>
@@ -6427,6 +7406,7 @@
         </w:rPr>
         <w:t xml:space="preserve">Flask backend Service: </w:t>
       </w:r>
+      <w:proofErr w:type="spellStart"/>
       <w:r>
         <w:rPr>
           <w:rFonts w:ascii="Times New Roman" w:eastAsia="Times New Roman" w:hAnsi="Times New Roman" w:cs="Times New Roman"/>
@@ -6438,6 +7418,7 @@
         </w:rPr>
         <w:t>ClusterIP</w:t>
       </w:r>
+      <w:proofErr w:type="spellEnd"/>
     </w:p>
     <w:p>
       <w:pPr>
@@ -6462,6 +7443,7 @@
         </w:rPr>
         <w:t xml:space="preserve">Node.js frontend Service: </w:t>
       </w:r>
+      <w:proofErr w:type="spellStart"/>
       <w:r>
         <w:rPr>
           <w:rFonts w:ascii="Times New Roman" w:eastAsia="Times New Roman" w:hAnsi="Times New Roman" w:cs="Times New Roman"/>
@@ -6473,6 +7455,7 @@
         </w:rPr>
         <w:t>NodePort</w:t>
       </w:r>
+      <w:proofErr w:type="spellEnd"/>
     </w:p>
     <w:p>
       <w:pPr>
@@ -6504,14 +7487,25 @@
         </w:rPr>
         <w:t xml:space="preserve"> Final </w:t>
       </w:r>
-      <w:r>
-        <w:rPr>
-          <w:rFonts w:ascii="Courier New" w:eastAsia="Times New Roman" w:hAnsi="Courier New" w:cs="Courier New"/>
-          <w:sz w:val="20"/>
-          <w:szCs w:val="20"/>
-          <w:lang w:eastAsia="en-IN"/>
-        </w:rPr>
-        <w:t>kubectl get deployments</w:t>
+      <w:proofErr w:type="spellStart"/>
+      <w:r>
+        <w:rPr>
+          <w:rFonts w:ascii="Courier New" w:eastAsia="Times New Roman" w:hAnsi="Courier New" w:cs="Courier New"/>
+          <w:sz w:val="20"/>
+          <w:szCs w:val="20"/>
+          <w:lang w:eastAsia="en-IN"/>
+        </w:rPr>
+        <w:t>kubectl</w:t>
+      </w:r>
+      <w:proofErr w:type="spellEnd"/>
+      <w:r>
+        <w:rPr>
+          <w:rFonts w:ascii="Courier New" w:eastAsia="Times New Roman" w:hAnsi="Courier New" w:cs="Courier New"/>
+          <w:sz w:val="20"/>
+          <w:szCs w:val="20"/>
+          <w:lang w:eastAsia="en-IN"/>
+        </w:rPr>
+        <w:t xml:space="preserve"> get deployments</w:t>
       </w:r>
       <w:r>
         <w:rPr>
@@ -6522,14 +7516,25 @@
         </w:rPr>
         <w:t xml:space="preserve">, </w:t>
       </w:r>
-      <w:r>
-        <w:rPr>
-          <w:rFonts w:ascii="Courier New" w:eastAsia="Times New Roman" w:hAnsi="Courier New" w:cs="Courier New"/>
-          <w:sz w:val="20"/>
-          <w:szCs w:val="20"/>
-          <w:lang w:eastAsia="en-IN"/>
-        </w:rPr>
-        <w:t>kubectl get pods</w:t>
+      <w:proofErr w:type="spellStart"/>
+      <w:r>
+        <w:rPr>
+          <w:rFonts w:ascii="Courier New" w:eastAsia="Times New Roman" w:hAnsi="Courier New" w:cs="Courier New"/>
+          <w:sz w:val="20"/>
+          <w:szCs w:val="20"/>
+          <w:lang w:eastAsia="en-IN"/>
+        </w:rPr>
+        <w:t>kubectl</w:t>
+      </w:r>
+      <w:proofErr w:type="spellEnd"/>
+      <w:r>
+        <w:rPr>
+          <w:rFonts w:ascii="Courier New" w:eastAsia="Times New Roman" w:hAnsi="Courier New" w:cs="Courier New"/>
+          <w:sz w:val="20"/>
+          <w:szCs w:val="20"/>
+          <w:lang w:eastAsia="en-IN"/>
+        </w:rPr>
+        <w:t xml:space="preserve"> get pods</w:t>
       </w:r>
       <w:r>
         <w:rPr>
@@ -6540,14 +7545,25 @@
         </w:rPr>
         <w:t xml:space="preserve">, and </w:t>
       </w:r>
-      <w:r>
-        <w:rPr>
-          <w:rFonts w:ascii="Courier New" w:eastAsia="Times New Roman" w:hAnsi="Courier New" w:cs="Courier New"/>
-          <w:sz w:val="20"/>
-          <w:szCs w:val="20"/>
-          <w:lang w:eastAsia="en-IN"/>
-        </w:rPr>
-        <w:t>kubectl get services</w:t>
+      <w:proofErr w:type="spellStart"/>
+      <w:r>
+        <w:rPr>
+          <w:rFonts w:ascii="Courier New" w:eastAsia="Times New Roman" w:hAnsi="Courier New" w:cs="Courier New"/>
+          <w:sz w:val="20"/>
+          <w:szCs w:val="20"/>
+          <w:lang w:eastAsia="en-IN"/>
+        </w:rPr>
+        <w:t>kubectl</w:t>
+      </w:r>
+      <w:proofErr w:type="spellEnd"/>
+      <w:r>
+        <w:rPr>
+          <w:rFonts w:ascii="Courier New" w:eastAsia="Times New Roman" w:hAnsi="Courier New" w:cs="Courier New"/>
+          <w:sz w:val="20"/>
+          <w:szCs w:val="20"/>
+          <w:lang w:eastAsia="en-IN"/>
+        </w:rPr>
+        <w:t xml:space="preserve"> get services</w:t>
       </w:r>
       <w:r>
         <w:rPr>
@@ -6689,8 +7705,19 @@
           <w:szCs w:val="20"/>
           <w:lang w:eastAsia="en-IN"/>
         </w:rPr>
-        <w:t>k8s/backend.yaml</w:t>
-      </w:r>
+        <w:t>k8s/</w:t>
+      </w:r>
+      <w:proofErr w:type="spellStart"/>
+      <w:r>
+        <w:rPr>
+          <w:rFonts w:ascii="Courier New" w:eastAsia="Times New Roman" w:hAnsi="Courier New" w:cs="Courier New"/>
+          <w:sz w:val="20"/>
+          <w:szCs w:val="20"/>
+          <w:lang w:eastAsia="en-IN"/>
+        </w:rPr>
+        <w:t>backend.yaml</w:t>
+      </w:r>
+      <w:proofErr w:type="spellEnd"/>
     </w:p>
     <w:p>
       <w:pPr>
@@ -6822,14 +7849,25 @@
           <w:lang w:eastAsia="en-IN"/>
         </w:rPr>
       </w:pPr>
-      <w:r>
-        <w:rPr>
-          <w:rFonts w:ascii="Times New Roman" w:eastAsia="Times New Roman" w:hAnsi="Times New Roman" w:cs="Times New Roman"/>
-          <w:sz w:val="24"/>
-          <w:szCs w:val="24"/>
-          <w:lang w:eastAsia="en-IN"/>
-        </w:rPr>
-        <w:t>ClusterIP Service</w:t>
+      <w:proofErr w:type="spellStart"/>
+      <w:r>
+        <w:rPr>
+          <w:rFonts w:ascii="Times New Roman" w:eastAsia="Times New Roman" w:hAnsi="Times New Roman" w:cs="Times New Roman"/>
+          <w:sz w:val="24"/>
+          <w:szCs w:val="24"/>
+          <w:lang w:eastAsia="en-IN"/>
+        </w:rPr>
+        <w:t>ClusterIP</w:t>
+      </w:r>
+      <w:proofErr w:type="spellEnd"/>
+      <w:r>
+        <w:rPr>
+          <w:rFonts w:ascii="Times New Roman" w:eastAsia="Times New Roman" w:hAnsi="Times New Roman" w:cs="Times New Roman"/>
+          <w:sz w:val="24"/>
+          <w:szCs w:val="24"/>
+          <w:lang w:eastAsia="en-IN"/>
+        </w:rPr>
+        <w:t xml:space="preserve"> Service</w:t>
       </w:r>
     </w:p>
     <w:p>
@@ -6936,8 +7974,19 @@
           <w:szCs w:val="20"/>
           <w:lang w:eastAsia="en-IN"/>
         </w:rPr>
-        <w:t>k8s/frontend.yaml</w:t>
-      </w:r>
+        <w:t>k8s/</w:t>
+      </w:r>
+      <w:proofErr w:type="spellStart"/>
+      <w:r>
+        <w:rPr>
+          <w:rFonts w:ascii="Courier New" w:eastAsia="Times New Roman" w:hAnsi="Courier New" w:cs="Courier New"/>
+          <w:sz w:val="20"/>
+          <w:szCs w:val="20"/>
+          <w:lang w:eastAsia="en-IN"/>
+        </w:rPr>
+        <w:t>frontend.yaml</w:t>
+      </w:r>
+      <w:proofErr w:type="spellEnd"/>
     </w:p>
     <w:p>
       <w:pPr>
@@ -7069,14 +8118,25 @@
           <w:lang w:eastAsia="en-IN"/>
         </w:rPr>
       </w:pPr>
-      <w:r>
-        <w:rPr>
-          <w:rFonts w:ascii="Times New Roman" w:eastAsia="Times New Roman" w:hAnsi="Times New Roman" w:cs="Times New Roman"/>
-          <w:sz w:val="24"/>
-          <w:szCs w:val="24"/>
-          <w:lang w:eastAsia="en-IN"/>
-        </w:rPr>
-        <w:t>NodePort Service</w:t>
+      <w:proofErr w:type="spellStart"/>
+      <w:r>
+        <w:rPr>
+          <w:rFonts w:ascii="Times New Roman" w:eastAsia="Times New Roman" w:hAnsi="Times New Roman" w:cs="Times New Roman"/>
+          <w:sz w:val="24"/>
+          <w:szCs w:val="24"/>
+          <w:lang w:eastAsia="en-IN"/>
+        </w:rPr>
+        <w:t>NodePort</w:t>
+      </w:r>
+      <w:proofErr w:type="spellEnd"/>
+      <w:r>
+        <w:rPr>
+          <w:rFonts w:ascii="Times New Roman" w:eastAsia="Times New Roman" w:hAnsi="Times New Roman" w:cs="Times New Roman"/>
+          <w:sz w:val="24"/>
+          <w:szCs w:val="24"/>
+          <w:lang w:eastAsia="en-IN"/>
+        </w:rPr>
+        <w:t xml:space="preserve"> Service</w:t>
       </w:r>
     </w:p>
     <w:p>
@@ -7469,14 +8529,25 @@
           <w:lang w:eastAsia="en-IN"/>
         </w:rPr>
       </w:pPr>
-      <w:r>
-        <w:rPr>
-          <w:rFonts w:ascii="Courier New" w:eastAsia="Times New Roman" w:hAnsi="Courier New" w:cs="Courier New"/>
-          <w:sz w:val="20"/>
-          <w:szCs w:val="20"/>
-          <w:lang w:eastAsia="en-IN"/>
-        </w:rPr>
-        <w:t>Kubernetes_Namrata\k8s</w:t>
+      <w:proofErr w:type="spellStart"/>
+      <w:r>
+        <w:rPr>
+          <w:rFonts w:ascii="Courier New" w:eastAsia="Times New Roman" w:hAnsi="Courier New" w:cs="Courier New"/>
+          <w:sz w:val="20"/>
+          <w:szCs w:val="20"/>
+          <w:lang w:eastAsia="en-IN"/>
+        </w:rPr>
+        <w:t>Kubernetes_Namrata</w:t>
+      </w:r>
+      <w:proofErr w:type="spellEnd"/>
+      <w:r>
+        <w:rPr>
+          <w:rFonts w:ascii="Courier New" w:eastAsia="Times New Roman" w:hAnsi="Courier New" w:cs="Courier New"/>
+          <w:sz w:val="20"/>
+          <w:szCs w:val="20"/>
+          <w:lang w:eastAsia="en-IN"/>
+        </w:rPr>
+        <w:t>\k8s</w:t>
       </w:r>
     </w:p>
     <w:p>
@@ -7527,14 +8598,25 @@
           <w:lang w:eastAsia="en-IN"/>
         </w:rPr>
       </w:pPr>
-      <w:r>
-        <w:rPr>
-          <w:rFonts w:ascii="Courier New" w:eastAsia="Times New Roman" w:hAnsi="Courier New" w:cs="Courier New"/>
-          <w:sz w:val="20"/>
-          <w:szCs w:val="20"/>
-          <w:lang w:eastAsia="en-IN"/>
-        </w:rPr>
-        <w:t>Kubernetes_Namrata\screenshots</w:t>
+      <w:proofErr w:type="spellStart"/>
+      <w:r>
+        <w:rPr>
+          <w:rFonts w:ascii="Courier New" w:eastAsia="Times New Roman" w:hAnsi="Courier New" w:cs="Courier New"/>
+          <w:sz w:val="20"/>
+          <w:szCs w:val="20"/>
+          <w:lang w:eastAsia="en-IN"/>
+        </w:rPr>
+        <w:t>Kubernetes_Namrata</w:t>
+      </w:r>
+      <w:proofErr w:type="spellEnd"/>
+      <w:r>
+        <w:rPr>
+          <w:rFonts w:ascii="Courier New" w:eastAsia="Times New Roman" w:hAnsi="Courier New" w:cs="Courier New"/>
+          <w:sz w:val="20"/>
+          <w:szCs w:val="20"/>
+          <w:lang w:eastAsia="en-IN"/>
+        </w:rPr>
+        <w:t>\screenshots</w:t>
       </w:r>
     </w:p>
     <w:p>
@@ -7661,52 +8743,29 @@
     </w:p>
     <w:p>
       <w:pPr>
-        <w:tabs>
-          <w:tab w:val="left" w:pos="916"/>
-          <w:tab w:val="left" w:pos="1832"/>
-          <w:tab w:val="left" w:pos="2748"/>
-          <w:tab w:val="left" w:pos="3664"/>
-          <w:tab w:val="left" w:pos="4580"/>
-          <w:tab w:val="left" w:pos="5496"/>
-          <w:tab w:val="left" w:pos="6412"/>
-          <w:tab w:val="left" w:pos="7328"/>
-          <w:tab w:val="left" w:pos="8244"/>
-          <w:tab w:val="left" w:pos="9160"/>
-          <w:tab w:val="left" w:pos="10076"/>
-          <w:tab w:val="left" w:pos="10992"/>
-          <w:tab w:val="left" w:pos="11908"/>
-          <w:tab w:val="left" w:pos="12824"/>
-          <w:tab w:val="left" w:pos="13740"/>
-          <w:tab w:val="left" w:pos="14656"/>
-        </w:tabs>
-        <w:spacing w:after="0" w:line="240" w:lineRule="auto"/>
-        <w:rPr>
-          <w:rFonts w:ascii="Courier New" w:eastAsia="Times New Roman" w:hAnsi="Courier New" w:cs="Courier New"/>
-          <w:sz w:val="20"/>
-          <w:szCs w:val="20"/>
-          <w:lang w:eastAsia="en-IN"/>
-        </w:rPr>
-      </w:pPr>
-      <w:r>
-        <w:rPr>
-          <w:rFonts w:ascii="Courier New" w:eastAsia="Times New Roman" w:hAnsi="Courier New" w:cs="Courier New"/>
-          <w:sz w:val="20"/>
-          <w:szCs w:val="20"/>
-          <w:lang w:eastAsia="en-IN"/>
-        </w:rPr>
-        <w:t>TO BE ADDED AFTER CREATING THE Kubernetes_Namrata GITHUB REPOSITORY</w:t>
-      </w:r>
-    </w:p>
-    <w:p>
-      <w:pPr>
-        <w:spacing w:before="100" w:beforeAutospacing="1" w:after="100" w:afterAutospacing="1" w:line="240" w:lineRule="auto"/>
-        <w:rPr>
-          <w:rFonts w:ascii="Times New Roman" w:eastAsia="Times New Roman" w:hAnsi="Times New Roman" w:cs="Times New Roman"/>
-          <w:sz w:val="24"/>
-          <w:szCs w:val="24"/>
-          <w:lang w:eastAsia="en-IN"/>
-        </w:rPr>
-      </w:pPr>
+        <w:spacing w:before="100" w:beforeAutospacing="1" w:after="100" w:afterAutospacing="1" w:line="240" w:lineRule="auto"/>
+      </w:pPr>
+      <w:hyperlink r:id="rId6" w:history="1">
+        <w:r>
+          <w:rPr>
+            <w:rStyle w:val="Hyperlink"/>
+          </w:rPr>
+          <w:t>https://github.com/namratajadhav13/Kubernetes_Namrata</w:t>
+        </w:r>
+      </w:hyperlink>
+    </w:p>
+    <w:p>
+      <w:pPr>
+        <w:spacing w:before="100" w:beforeAutospacing="1" w:after="100" w:afterAutospacing="1" w:line="240" w:lineRule="auto"/>
+        <w:rPr>
+          <w:rFonts w:ascii="Times New Roman" w:eastAsia="Times New Roman" w:hAnsi="Times New Roman" w:cs="Times New Roman"/>
+          <w:sz w:val="24"/>
+          <w:szCs w:val="24"/>
+          <w:lang w:eastAsia="en-IN"/>
+        </w:rPr>
+      </w:pPr>
+      <w:bookmarkStart w:id="0" w:name="_GoBack"/>
+      <w:bookmarkEnd w:id="0"/>
       <w:r>
         <w:rPr>
           <w:rFonts w:ascii="Times New Roman" w:eastAsia="Times New Roman" w:hAnsi="Times New Roman" w:cs="Times New Roman"/>
@@ -7783,27 +8842,87 @@
           <w:szCs w:val="24"/>
           <w:lang w:eastAsia="en-IN"/>
         </w:rPr>
-        <w:t>The Flask backend and Node.js frontend were successfully deployed to a local Kubernetes cluster using Minikube.</w:t>
-      </w:r>
-    </w:p>
-    <w:p>
-      <w:pPr>
-        <w:spacing w:before="100" w:beforeAutospacing="1" w:after="100" w:afterAutospacing="1" w:line="240" w:lineRule="auto"/>
-        <w:rPr>
-          <w:rFonts w:ascii="Times New Roman" w:eastAsia="Times New Roman" w:hAnsi="Times New Roman" w:cs="Times New Roman"/>
-          <w:sz w:val="24"/>
-          <w:szCs w:val="24"/>
-          <w:lang w:eastAsia="en-IN"/>
-        </w:rPr>
-      </w:pPr>
-      <w:r>
-        <w:rPr>
-          <w:rFonts w:ascii="Times New Roman" w:eastAsia="Times New Roman" w:hAnsi="Times New Roman" w:cs="Times New Roman"/>
-          <w:sz w:val="24"/>
-          <w:szCs w:val="24"/>
-          <w:lang w:eastAsia="en-IN"/>
-        </w:rPr>
-        <w:t>The Docker images were successfully created and loaded into Minikube. Kubernetes Deployments and Services were created for both applications.</w:t>
+        <w:t xml:space="preserve">The Flask backend and Node.js frontend </w:t>
+      </w:r>
+      <w:proofErr w:type="gramStart"/>
+      <w:r>
+        <w:rPr>
+          <w:rFonts w:ascii="Times New Roman" w:eastAsia="Times New Roman" w:hAnsi="Times New Roman" w:cs="Times New Roman"/>
+          <w:sz w:val="24"/>
+          <w:szCs w:val="24"/>
+          <w:lang w:eastAsia="en-IN"/>
+        </w:rPr>
+        <w:t>were</w:t>
+      </w:r>
+      <w:proofErr w:type="gramEnd"/>
+      <w:r>
+        <w:rPr>
+          <w:rFonts w:ascii="Times New Roman" w:eastAsia="Times New Roman" w:hAnsi="Times New Roman" w:cs="Times New Roman"/>
+          <w:sz w:val="24"/>
+          <w:szCs w:val="24"/>
+          <w:lang w:eastAsia="en-IN"/>
+        </w:rPr>
+        <w:t xml:space="preserve"> successfully deployed to a local Kubernetes cluster using </w:t>
+      </w:r>
+      <w:proofErr w:type="spellStart"/>
+      <w:r>
+        <w:rPr>
+          <w:rFonts w:ascii="Times New Roman" w:eastAsia="Times New Roman" w:hAnsi="Times New Roman" w:cs="Times New Roman"/>
+          <w:sz w:val="24"/>
+          <w:szCs w:val="24"/>
+          <w:lang w:eastAsia="en-IN"/>
+        </w:rPr>
+        <w:t>Minikube</w:t>
+      </w:r>
+      <w:proofErr w:type="spellEnd"/>
+      <w:r>
+        <w:rPr>
+          <w:rFonts w:ascii="Times New Roman" w:eastAsia="Times New Roman" w:hAnsi="Times New Roman" w:cs="Times New Roman"/>
+          <w:sz w:val="24"/>
+          <w:szCs w:val="24"/>
+          <w:lang w:eastAsia="en-IN"/>
+        </w:rPr>
+        <w:t>.</w:t>
+      </w:r>
+    </w:p>
+    <w:p>
+      <w:pPr>
+        <w:spacing w:before="100" w:beforeAutospacing="1" w:after="100" w:afterAutospacing="1" w:line="240" w:lineRule="auto"/>
+        <w:rPr>
+          <w:rFonts w:ascii="Times New Roman" w:eastAsia="Times New Roman" w:hAnsi="Times New Roman" w:cs="Times New Roman"/>
+          <w:sz w:val="24"/>
+          <w:szCs w:val="24"/>
+          <w:lang w:eastAsia="en-IN"/>
+        </w:rPr>
+      </w:pPr>
+      <w:r>
+        <w:rPr>
+          <w:rFonts w:ascii="Times New Roman" w:eastAsia="Times New Roman" w:hAnsi="Times New Roman" w:cs="Times New Roman"/>
+          <w:sz w:val="24"/>
+          <w:szCs w:val="24"/>
+          <w:lang w:eastAsia="en-IN"/>
+        </w:rPr>
+        <w:t xml:space="preserve">The Docker images were successfully created and loaded into </w:t>
+      </w:r>
+      <w:proofErr w:type="spellStart"/>
+      <w:r>
+        <w:rPr>
+          <w:rFonts w:ascii="Times New Roman" w:eastAsia="Times New Roman" w:hAnsi="Times New Roman" w:cs="Times New Roman"/>
+          <w:sz w:val="24"/>
+          <w:szCs w:val="24"/>
+          <w:lang w:eastAsia="en-IN"/>
+        </w:rPr>
+        <w:t>Minikube</w:t>
+      </w:r>
+      <w:proofErr w:type="spellEnd"/>
+      <w:r>
+        <w:rPr>
+          <w:rFonts w:ascii="Times New Roman" w:eastAsia="Times New Roman" w:hAnsi="Times New Roman" w:cs="Times New Roman"/>
+          <w:sz w:val="24"/>
+          <w:szCs w:val="24"/>
+          <w:lang w:eastAsia="en-IN"/>
+        </w:rPr>
+        <w:t>. Kubernetes Deployments and Services were created for both applications.</w:t>
       </w:r>
     </w:p>
     <w:p>
@@ -7843,7 +8962,27 @@
           <w:szCs w:val="24"/>
           <w:lang w:eastAsia="en-IN"/>
         </w:rPr>
-        <w:t>The Node.js frontend was accessed successfully through a Kubernetes NodePort Service, and the Flask backend was successfully tested using Kubernetes port forwarding.</w:t>
+        <w:t xml:space="preserve">The Node.js frontend was accessed successfully through a Kubernetes </w:t>
+      </w:r>
+      <w:proofErr w:type="spellStart"/>
+      <w:r>
+        <w:rPr>
+          <w:rFonts w:ascii="Times New Roman" w:eastAsia="Times New Roman" w:hAnsi="Times New Roman" w:cs="Times New Roman"/>
+          <w:sz w:val="24"/>
+          <w:szCs w:val="24"/>
+          <w:lang w:eastAsia="en-IN"/>
+        </w:rPr>
+        <w:t>NodePort</w:t>
+      </w:r>
+      <w:proofErr w:type="spellEnd"/>
+      <w:r>
+        <w:rPr>
+          <w:rFonts w:ascii="Times New Roman" w:eastAsia="Times New Roman" w:hAnsi="Times New Roman" w:cs="Times New Roman"/>
+          <w:sz w:val="24"/>
+          <w:szCs w:val="24"/>
+          <w:lang w:eastAsia="en-IN"/>
+        </w:rPr>
+        <w:t xml:space="preserve"> Service, and the Flask backend was successfully tested using Kubernetes port forwarding.</w:t>
       </w:r>
     </w:p>
     <w:p>
@@ -7866,10 +9005,7 @@
         <w:t>Therefore, the Kubernetes deployment requirements for this assignment have been successfully completed.</w:t>
       </w:r>
     </w:p>
-    <w:p>
-      <w:bookmarkStart w:id="0" w:name="_GoBack"/>
-      <w:bookmarkEnd w:id="0"/>
-    </w:p>
+    <w:p/>
     <w:sectPr>
       <w:pgSz w:w="11906" w:h="16838"/>
       <w:pgMar w:top="1440" w:right="1440" w:bottom="1440" w:left="1440" w:header="708" w:footer="708" w:gutter="0"/>
@@ -9278,6 +10414,17 @@
       <w:lang w:eastAsia="en-IN"/>
     </w:rPr>
   </w:style>
+  <w:style w:type="character" w:styleId="Hyperlink">
+    <w:name w:val="Hyperlink"/>
+    <w:basedOn w:val="DefaultParagraphFont"/>
+    <w:uiPriority w:val="99"/>
+    <w:unhideWhenUsed/>
+    <w:rsid w:val="0078608D"/>
+    <w:rPr>
+      <w:color w:val="0563C1" w:themeColor="hyperlink"/>
+      <w:u w:val="single"/>
+    </w:rPr>
+  </w:style>
 </w:styles>
 </file>
 
@@ -9540,4 +10687,16 @@
     </a:ext>
   </a:extLst>
 </a:theme>
+</file>
+
+<file path=customXml/item1.xml><?xml version="1.0" encoding="utf-8"?>
+<b:Sources xmlns:b="http://schemas.openxmlformats.org/officeDocument/2006/bibliography" xmlns="http://schemas.openxmlformats.org/officeDocument/2006/bibliography" SelectedStyle="\APASixthEditionOfficeOnline.xsl" StyleName="APA" Version="6"/>
+</file>
+
+<file path=customXml/itemProps1.xml><?xml version="1.0" encoding="utf-8"?>
+<ds:datastoreItem xmlns:ds="http://schemas.openxmlformats.org/officeDocument/2006/customXml" ds:itemID="{52B71BE3-4900-4E72-8955-1DFB82DEC4D9}">
+  <ds:schemaRefs>
+    <ds:schemaRef ds:uri="http://schemas.openxmlformats.org/officeDocument/2006/bibliography"/>
+  </ds:schemaRefs>
+</ds:datastoreItem>
 </file>
</xml_diff>